<commit_message>
new Trade und Forest data
</commit_message>
<xml_diff>
--- a/Data_Tariffs_and_Forest_Stock/Manual/Scenario_input_data_generation_Tariffs_Forest.docx
+++ b/Data_Tariffs_and_Forest_Stock/Manual/Scenario_input_data_generation_Tariffs_Forest.docx
@@ -96,6 +96,13 @@
     </w:p>
     <w:sdt>
       <w:sdtPr>
+        <w:rPr>
+          <w:rFonts w:asciiTheme="minorHAnsi" w:eastAsiaTheme="minorHAnsi" w:hAnsiTheme="minorHAnsi" w:cstheme="minorBidi"/>
+          <w:color w:val="auto"/>
+          <w:sz w:val="22"/>
+          <w:szCs w:val="22"/>
+          <w:lang w:val="de-DE"/>
+        </w:rPr>
         <w:id w:val="-451401714"/>
         <w:docPartObj>
           <w:docPartGallery w:val="Table of Contents"/>
@@ -104,14 +111,9 @@
       </w:sdtPr>
       <w:sdtEndPr>
         <w:rPr>
-          <w:rFonts w:asciiTheme="minorHAnsi" w:eastAsiaTheme="minorHAnsi" w:hAnsiTheme="minorHAnsi" w:cstheme="minorBidi"/>
           <w:b/>
           <w:bCs/>
           <w:noProof/>
-          <w:color w:val="auto"/>
-          <w:sz w:val="22"/>
-          <w:szCs w:val="22"/>
-          <w:lang w:val="de-DE"/>
         </w:rPr>
       </w:sdtEndPr>
       <w:sdtContent>
@@ -146,7 +148,7 @@
             <w:rPr>
               <w:rFonts w:ascii="Times New Roman" w:eastAsiaTheme="minorEastAsia" w:hAnsi="Times New Roman" w:cs="Times New Roman"/>
               <w:noProof/>
-              <w:lang w:val="en-DE" w:eastAsia="en-DE"/>
+              <w:lang/>
             </w:rPr>
           </w:pPr>
           <w:r>
@@ -252,7 +254,7 @@
             <w:rPr>
               <w:rFonts w:ascii="Times New Roman" w:eastAsiaTheme="minorEastAsia" w:hAnsi="Times New Roman" w:cs="Times New Roman"/>
               <w:noProof/>
-              <w:lang w:val="en-DE" w:eastAsia="en-DE"/>
+              <w:lang/>
             </w:rPr>
           </w:pPr>
           <w:hyperlink w:anchor="_Toc191022856" w:history="1">
@@ -269,7 +271,7 @@
               <w:rPr>
                 <w:rFonts w:ascii="Times New Roman" w:eastAsiaTheme="minorEastAsia" w:hAnsi="Times New Roman" w:cs="Times New Roman"/>
                 <w:noProof/>
-                <w:lang w:val="en-DE" w:eastAsia="en-DE"/>
+                <w:lang/>
               </w:rPr>
               <w:tab/>
             </w:r>
@@ -348,7 +350,7 @@
             <w:rPr>
               <w:rFonts w:ascii="Times New Roman" w:eastAsiaTheme="minorEastAsia" w:hAnsi="Times New Roman" w:cs="Times New Roman"/>
               <w:noProof/>
-              <w:lang w:val="en-DE" w:eastAsia="en-DE"/>
+              <w:lang/>
             </w:rPr>
           </w:pPr>
           <w:hyperlink w:anchor="_Toc191022857" w:history="1">
@@ -428,7 +430,7 @@
             <w:rPr>
               <w:rFonts w:ascii="Times New Roman" w:eastAsiaTheme="minorEastAsia" w:hAnsi="Times New Roman" w:cs="Times New Roman"/>
               <w:noProof/>
-              <w:lang w:val="en-DE" w:eastAsia="en-DE"/>
+              <w:lang/>
             </w:rPr>
           </w:pPr>
           <w:hyperlink w:anchor="_Toc191022858" w:history="1">
@@ -445,7 +447,7 @@
               <w:rPr>
                 <w:rFonts w:ascii="Times New Roman" w:eastAsiaTheme="minorEastAsia" w:hAnsi="Times New Roman" w:cs="Times New Roman"/>
                 <w:noProof/>
-                <w:lang w:val="en-DE" w:eastAsia="en-DE"/>
+                <w:lang/>
               </w:rPr>
               <w:tab/>
             </w:r>
@@ -525,7 +527,7 @@
             <w:rPr>
               <w:rFonts w:ascii="Times New Roman" w:eastAsiaTheme="minorEastAsia" w:hAnsi="Times New Roman" w:cs="Times New Roman"/>
               <w:noProof/>
-              <w:lang w:val="en-DE" w:eastAsia="en-DE"/>
+              <w:lang/>
             </w:rPr>
           </w:pPr>
           <w:hyperlink w:anchor="_Toc191022859" w:history="1">
@@ -542,7 +544,7 @@
               <w:rPr>
                 <w:rFonts w:ascii="Times New Roman" w:eastAsiaTheme="minorEastAsia" w:hAnsi="Times New Roman" w:cs="Times New Roman"/>
                 <w:noProof/>
-                <w:lang w:val="en-DE" w:eastAsia="en-DE"/>
+                <w:lang/>
               </w:rPr>
               <w:tab/>
             </w:r>
@@ -622,7 +624,7 @@
             <w:rPr>
               <w:rFonts w:ascii="Times New Roman" w:eastAsiaTheme="minorEastAsia" w:hAnsi="Times New Roman" w:cs="Times New Roman"/>
               <w:noProof/>
-              <w:lang w:val="en-DE" w:eastAsia="en-DE"/>
+              <w:lang/>
             </w:rPr>
           </w:pPr>
           <w:hyperlink w:anchor="_Toc191022860" w:history="1">
@@ -639,7 +641,7 @@
               <w:rPr>
                 <w:rFonts w:ascii="Times New Roman" w:eastAsiaTheme="minorEastAsia" w:hAnsi="Times New Roman" w:cs="Times New Roman"/>
                 <w:noProof/>
-                <w:lang w:val="en-DE" w:eastAsia="en-DE"/>
+                <w:lang/>
               </w:rPr>
               <w:tab/>
             </w:r>
@@ -719,7 +721,7 @@
             <w:rPr>
               <w:rFonts w:ascii="Times New Roman" w:eastAsiaTheme="minorEastAsia" w:hAnsi="Times New Roman" w:cs="Times New Roman"/>
               <w:noProof/>
-              <w:lang w:val="en-DE" w:eastAsia="en-DE"/>
+              <w:lang/>
             </w:rPr>
           </w:pPr>
           <w:hyperlink w:anchor="_Toc191022861" w:history="1">
@@ -736,7 +738,7 @@
               <w:rPr>
                 <w:rFonts w:ascii="Times New Roman" w:eastAsiaTheme="minorEastAsia" w:hAnsi="Times New Roman" w:cs="Times New Roman"/>
                 <w:noProof/>
-                <w:lang w:val="en-DE" w:eastAsia="en-DE"/>
+                <w:lang/>
               </w:rPr>
               <w:tab/>
             </w:r>
@@ -815,7 +817,7 @@
             <w:rPr>
               <w:rFonts w:ascii="Times New Roman" w:eastAsiaTheme="minorEastAsia" w:hAnsi="Times New Roman" w:cs="Times New Roman"/>
               <w:noProof/>
-              <w:lang w:val="en-DE" w:eastAsia="en-DE"/>
+              <w:lang/>
             </w:rPr>
           </w:pPr>
           <w:hyperlink w:anchor="_Toc191022862" w:history="1">
@@ -894,7 +896,7 @@
             <w:rPr>
               <w:rFonts w:ascii="Times New Roman" w:eastAsiaTheme="minorEastAsia" w:hAnsi="Times New Roman" w:cs="Times New Roman"/>
               <w:noProof/>
-              <w:lang w:val="en-DE" w:eastAsia="en-DE"/>
+              <w:lang/>
             </w:rPr>
           </w:pPr>
           <w:hyperlink w:anchor="_Toc191022863" w:history="1">
@@ -911,7 +913,7 @@
               <w:rPr>
                 <w:rFonts w:ascii="Times New Roman" w:eastAsiaTheme="minorEastAsia" w:hAnsi="Times New Roman" w:cs="Times New Roman"/>
                 <w:noProof/>
-                <w:lang w:val="en-DE" w:eastAsia="en-DE"/>
+                <w:lang/>
               </w:rPr>
               <w:tab/>
             </w:r>
@@ -990,7 +992,7 @@
             <w:rPr>
               <w:rFonts w:ascii="Times New Roman" w:eastAsiaTheme="minorEastAsia" w:hAnsi="Times New Roman" w:cs="Times New Roman"/>
               <w:noProof/>
-              <w:lang w:val="en-DE" w:eastAsia="en-DE"/>
+              <w:lang/>
             </w:rPr>
           </w:pPr>
           <w:hyperlink w:anchor="_Toc191022864" w:history="1">
@@ -1069,7 +1071,7 @@
             <w:rPr>
               <w:rFonts w:ascii="Times New Roman" w:eastAsiaTheme="minorEastAsia" w:hAnsi="Times New Roman" w:cs="Times New Roman"/>
               <w:noProof/>
-              <w:lang w:val="en-DE" w:eastAsia="en-DE"/>
+              <w:lang/>
             </w:rPr>
           </w:pPr>
           <w:hyperlink w:anchor="_Toc191022865" w:history="1">
@@ -1148,7 +1150,7 @@
             <w:rPr>
               <w:rFonts w:ascii="Times New Roman" w:eastAsiaTheme="minorEastAsia" w:hAnsi="Times New Roman" w:cs="Times New Roman"/>
               <w:noProof/>
-              <w:lang w:val="en-DE" w:eastAsia="en-DE"/>
+              <w:lang/>
             </w:rPr>
           </w:pPr>
           <w:hyperlink w:anchor="_Toc191022866" w:history="1">
@@ -1334,15 +1336,7 @@
         <w:pStyle w:val="NormalWeb"/>
       </w:pPr>
       <w:r>
-        <w:t xml:space="preserve">Trade in </w:t>
-      </w:r>
-      <w:proofErr w:type="spellStart"/>
-      <w:r>
-        <w:t>TiMBA</w:t>
-      </w:r>
-      <w:proofErr w:type="spellEnd"/>
-      <w:r>
-        <w:t xml:space="preserve"> depends</w:t>
+        <w:t>Trade in TiMBA depends</w:t>
       </w:r>
       <w:r>
         <w:rPr>
@@ -1368,11 +1362,9 @@
         </w:rPr>
         <w:t>T</w:t>
       </w:r>
-      <w:proofErr w:type="spellStart"/>
       <w:r>
         <w:t>ariffs</w:t>
       </w:r>
-      <w:proofErr w:type="spellEnd"/>
       <w:r>
         <w:rPr>
           <w:lang w:val="en-US"/>
@@ -1427,13 +1419,7 @@
         <w:rPr>
           <w:lang w:val="en-US"/>
         </w:rPr>
-        <w:t>(WTO 2024)</w:t>
-      </w:r>
-      <w:r>
-        <w:rPr>
-          <w:lang w:val="en-US"/>
-        </w:rPr>
-        <w:t xml:space="preserve"> </w:t>
+        <w:t xml:space="preserve">(WTO 2024) </w:t>
       </w:r>
       <w:r>
         <w:t xml:space="preserve">notifications using </w:t>
@@ -1503,6 +1489,7 @@
         </w:rPr>
       </w:pPr>
       <w:r>
+        <w:lastRenderedPageBreak/>
         <w:t xml:space="preserve">This </w:t>
       </w:r>
       <w:r>
@@ -1545,21 +1532,7 @@
         <w:rPr>
           <w:rStyle w:val="Strong"/>
         </w:rPr>
-        <w:t>Most-</w:t>
-      </w:r>
-      <w:proofErr w:type="spellStart"/>
-      <w:r>
-        <w:rPr>
-          <w:rStyle w:val="Strong"/>
-        </w:rPr>
-        <w:t>Favored</w:t>
-      </w:r>
-      <w:proofErr w:type="spellEnd"/>
-      <w:r>
-        <w:rPr>
-          <w:rStyle w:val="Strong"/>
-        </w:rPr>
-        <w:t>-Nation (MFN)</w:t>
+        <w:t>Most-Favored-Nation (MFN)</w:t>
       </w:r>
       <w:r>
         <w:t xml:space="preserve"> applied tariff, and trade agreements were not considered in the calculations. </w:t>
@@ -2436,6 +2409,7 @@
         <w:rPr>
           <w:lang w:val="en-US"/>
         </w:rPr>
+        <w:lastRenderedPageBreak/>
         <w:t xml:space="preserve">Some products are represented by more than one 4-digit and / or 6-digit HS code. When this occurs, the tariffs for these codes are treated separately for the calculation, and the final ad valorem rate reflects the aggregate or a representative value based on the available data. In case that a product in </w:t>
       </w:r>
       <w:proofErr w:type="spellStart"/>
@@ -2537,11 +2511,9 @@
         </w:rPr>
         <w:t>able 1: P</w:t>
       </w:r>
-      <w:proofErr w:type="spellStart"/>
       <w:r>
         <w:t>roducts</w:t>
       </w:r>
-      <w:proofErr w:type="spellEnd"/>
       <w:r>
         <w:rPr>
           <w:lang w:val="en-US"/>
@@ -2593,14 +2565,14 @@
               <w:rPr>
                 <w:rFonts w:ascii="Times New Roman" w:eastAsia="Times New Roman" w:hAnsi="Times New Roman" w:cs="Times New Roman"/>
                 <w:color w:val="000000"/>
-                <w:lang w:val="en-US" w:eastAsia="en-DE"/>
+                <w:lang w:val="en-US"/>
               </w:rPr>
             </w:pPr>
             <w:r>
               <w:rPr>
                 <w:rFonts w:ascii="Times New Roman" w:eastAsia="Times New Roman" w:hAnsi="Times New Roman" w:cs="Times New Roman"/>
                 <w:color w:val="000000"/>
-                <w:lang w:val="en-US" w:eastAsia="en-DE"/>
+                <w:lang w:val="en-US"/>
               </w:rPr>
               <w:t>Product</w:t>
             </w:r>
@@ -2619,14 +2591,14 @@
               <w:rPr>
                 <w:rFonts w:ascii="Times New Roman" w:eastAsia="Times New Roman" w:hAnsi="Times New Roman" w:cs="Times New Roman"/>
                 <w:color w:val="000000"/>
-                <w:lang w:val="en-DE" w:eastAsia="en-DE"/>
+                <w:lang/>
               </w:rPr>
             </w:pPr>
             <w:r>
               <w:rPr>
                 <w:rFonts w:ascii="Times New Roman" w:eastAsia="Times New Roman" w:hAnsi="Times New Roman" w:cs="Times New Roman"/>
                 <w:color w:val="000000"/>
-                <w:lang w:val="en-DE" w:eastAsia="en-DE"/>
+                <w:lang/>
               </w:rPr>
               <w:t>HS code</w:t>
             </w:r>
@@ -2634,7 +2606,7 @@
               <w:rPr>
                 <w:rFonts w:ascii="Times New Roman" w:eastAsia="Times New Roman" w:hAnsi="Times New Roman" w:cs="Times New Roman"/>
                 <w:color w:val="000000"/>
-                <w:lang w:val="en-US" w:eastAsia="en-DE"/>
+                <w:lang w:val="en-US"/>
               </w:rPr>
               <w:t>s</w:t>
             </w:r>
@@ -2642,7 +2614,7 @@
               <w:rPr>
                 <w:rFonts w:ascii="Times New Roman" w:eastAsia="Times New Roman" w:hAnsi="Times New Roman" w:cs="Times New Roman"/>
                 <w:color w:val="000000"/>
-                <w:lang w:val="en-DE" w:eastAsia="en-DE"/>
+                <w:lang/>
               </w:rPr>
               <w:t xml:space="preserve"> </w:t>
             </w:r>
@@ -2665,7 +2637,7 @@
                 <w:rFonts w:ascii="Times New Roman" w:eastAsia="Times New Roman" w:hAnsi="Times New Roman" w:cs="Times New Roman"/>
                 <w:sz w:val="20"/>
                 <w:szCs w:val="20"/>
-                <w:lang w:val="en-DE" w:eastAsia="en-DE"/>
+                <w:lang/>
               </w:rPr>
             </w:pPr>
             <w:r>
@@ -2673,7 +2645,7 @@
                 <w:rFonts w:ascii="Times New Roman" w:eastAsia="Times New Roman" w:hAnsi="Times New Roman" w:cs="Times New Roman"/>
                 <w:sz w:val="20"/>
                 <w:szCs w:val="20"/>
-                <w:lang w:val="en-DE" w:eastAsia="en-DE"/>
+                <w:lang/>
               </w:rPr>
               <w:t>Fuelwood</w:t>
             </w:r>
@@ -2692,7 +2664,7 @@
                 <w:rFonts w:ascii="Times New Roman" w:eastAsia="Times New Roman" w:hAnsi="Times New Roman" w:cs="Times New Roman"/>
                 <w:sz w:val="20"/>
                 <w:szCs w:val="20"/>
-                <w:lang w:val="en-DE" w:eastAsia="en-DE"/>
+                <w:lang/>
               </w:rPr>
             </w:pPr>
             <w:r>
@@ -2700,7 +2672,7 @@
                 <w:rFonts w:ascii="Times New Roman" w:eastAsia="Times New Roman" w:hAnsi="Times New Roman" w:cs="Times New Roman"/>
                 <w:sz w:val="20"/>
                 <w:szCs w:val="20"/>
-                <w:lang w:val="en-DE" w:eastAsia="en-DE"/>
+                <w:lang/>
               </w:rPr>
               <w:t>4401</w:t>
             </w:r>
@@ -2723,7 +2695,7 @@
                 <w:rFonts w:ascii="Times New Roman" w:eastAsia="Times New Roman" w:hAnsi="Times New Roman" w:cs="Times New Roman"/>
                 <w:sz w:val="20"/>
                 <w:szCs w:val="20"/>
-                <w:lang w:val="en-US" w:eastAsia="en-DE"/>
+                <w:lang w:val="en-US"/>
               </w:rPr>
             </w:pPr>
             <w:r>
@@ -2731,7 +2703,7 @@
                 <w:rFonts w:ascii="Times New Roman" w:eastAsia="Times New Roman" w:hAnsi="Times New Roman" w:cs="Times New Roman"/>
                 <w:sz w:val="20"/>
                 <w:szCs w:val="20"/>
-                <w:lang w:val="en-DE" w:eastAsia="en-DE"/>
+                <w:lang/>
               </w:rPr>
               <w:t>Ind</w:t>
             </w:r>
@@ -2741,7 +2713,7 @@
                 <w:rFonts w:ascii="Times New Roman" w:eastAsia="Times New Roman" w:hAnsi="Times New Roman" w:cs="Times New Roman"/>
                 <w:sz w:val="20"/>
                 <w:szCs w:val="20"/>
-                <w:lang w:val="en-US" w:eastAsia="en-DE"/>
+                <w:lang w:val="en-US"/>
               </w:rPr>
               <w:t>ustrial</w:t>
             </w:r>
@@ -2751,27 +2723,25 @@
                 <w:rFonts w:ascii="Times New Roman" w:eastAsia="Times New Roman" w:hAnsi="Times New Roman" w:cs="Times New Roman"/>
                 <w:sz w:val="20"/>
                 <w:szCs w:val="20"/>
-                <w:lang w:val="en-US" w:eastAsia="en-DE"/>
+                <w:lang w:val="en-US"/>
               </w:rPr>
               <w:t xml:space="preserve"> R</w:t>
             </w:r>
-            <w:proofErr w:type="spellStart"/>
             <w:r>
               <w:rPr>
                 <w:rFonts w:ascii="Times New Roman" w:eastAsia="Times New Roman" w:hAnsi="Times New Roman" w:cs="Times New Roman"/>
                 <w:sz w:val="20"/>
                 <w:szCs w:val="20"/>
-                <w:lang w:val="en-DE" w:eastAsia="en-DE"/>
+                <w:lang/>
               </w:rPr>
               <w:t>ound</w:t>
             </w:r>
-            <w:proofErr w:type="spellEnd"/>
             <w:r>
               <w:rPr>
                 <w:rFonts w:ascii="Times New Roman" w:eastAsia="Times New Roman" w:hAnsi="Times New Roman" w:cs="Times New Roman"/>
                 <w:sz w:val="20"/>
                 <w:szCs w:val="20"/>
-                <w:lang w:val="en-US" w:eastAsia="en-DE"/>
+                <w:lang w:val="en-US"/>
               </w:rPr>
               <w:t>wood</w:t>
             </w:r>
@@ -2790,7 +2760,7 @@
                 <w:rFonts w:ascii="Times New Roman" w:eastAsia="Times New Roman" w:hAnsi="Times New Roman" w:cs="Times New Roman"/>
                 <w:sz w:val="20"/>
                 <w:szCs w:val="20"/>
-                <w:lang w:val="en-DE" w:eastAsia="en-DE"/>
+                <w:lang/>
               </w:rPr>
             </w:pPr>
             <w:r>
@@ -2798,7 +2768,7 @@
                 <w:rFonts w:ascii="Times New Roman" w:eastAsia="Times New Roman" w:hAnsi="Times New Roman" w:cs="Times New Roman"/>
                 <w:sz w:val="20"/>
                 <w:szCs w:val="20"/>
-                <w:lang w:val="en-DE" w:eastAsia="en-DE"/>
+                <w:lang/>
               </w:rPr>
               <w:t>4403</w:t>
             </w:r>
@@ -2821,44 +2791,33 @@
                 <w:rFonts w:ascii="Times New Roman" w:eastAsia="Times New Roman" w:hAnsi="Times New Roman" w:cs="Times New Roman"/>
                 <w:sz w:val="20"/>
                 <w:szCs w:val="20"/>
-                <w:lang w:val="en-DE" w:eastAsia="en-DE"/>
+                <w:lang/>
               </w:rPr>
             </w:pPr>
-            <w:proofErr w:type="spellStart"/>
             <w:r>
               <w:rPr>
                 <w:rFonts w:ascii="Times New Roman" w:eastAsia="Times New Roman" w:hAnsi="Times New Roman" w:cs="Times New Roman"/>
                 <w:sz w:val="20"/>
                 <w:szCs w:val="20"/>
-                <w:lang w:val="en-DE" w:eastAsia="en-DE"/>
-              </w:rPr>
-              <w:t>Sawnwood</w:t>
-            </w:r>
-            <w:proofErr w:type="spellEnd"/>
+                <w:lang/>
+              </w:rPr>
+              <w:t xml:space="preserve">Sawnwood </w:t>
+            </w:r>
             <w:r>
               <w:rPr>
                 <w:rFonts w:ascii="Times New Roman" w:eastAsia="Times New Roman" w:hAnsi="Times New Roman" w:cs="Times New Roman"/>
                 <w:sz w:val="20"/>
                 <w:szCs w:val="20"/>
-                <w:lang w:val="en-DE" w:eastAsia="en-DE"/>
-              </w:rPr>
-              <w:t xml:space="preserve"> </w:t>
+                <w:lang w:val="en-US"/>
+              </w:rPr>
+              <w:t>N</w:t>
             </w:r>
             <w:r>
               <w:rPr>
                 <w:rFonts w:ascii="Times New Roman" w:eastAsia="Times New Roman" w:hAnsi="Times New Roman" w:cs="Times New Roman"/>
                 <w:sz w:val="20"/>
                 <w:szCs w:val="20"/>
-                <w:lang w:val="en-US" w:eastAsia="en-DE"/>
-              </w:rPr>
-              <w:t>N</w:t>
-            </w:r>
-            <w:r>
-              <w:rPr>
-                <w:rFonts w:ascii="Times New Roman" w:eastAsia="Times New Roman" w:hAnsi="Times New Roman" w:cs="Times New Roman"/>
-                <w:sz w:val="20"/>
-                <w:szCs w:val="20"/>
-                <w:lang w:val="en-DE" w:eastAsia="en-DE"/>
+                <w:lang/>
               </w:rPr>
               <w:t>on-coniferous</w:t>
             </w:r>
@@ -2877,7 +2836,7 @@
                 <w:rFonts w:ascii="Times New Roman" w:eastAsia="Times New Roman" w:hAnsi="Times New Roman" w:cs="Times New Roman"/>
                 <w:sz w:val="20"/>
                 <w:szCs w:val="20"/>
-                <w:lang w:val="en-DE" w:eastAsia="en-DE"/>
+                <w:lang/>
               </w:rPr>
             </w:pPr>
             <w:r>
@@ -2885,7 +2844,7 @@
                 <w:rFonts w:ascii="Times New Roman" w:eastAsia="Times New Roman" w:hAnsi="Times New Roman" w:cs="Times New Roman"/>
                 <w:sz w:val="20"/>
                 <w:szCs w:val="20"/>
-                <w:lang w:val="en-DE" w:eastAsia="en-DE"/>
+                <w:lang/>
               </w:rPr>
               <w:t>440721, 440722, 440723, 440724, 440725, 440726, 440727, 440728, 440729, 440791, 440792, 440793, 440794, 440795, 440796, 440797, 440799</w:t>
             </w:r>
@@ -2908,28 +2867,17 @@
                 <w:rFonts w:ascii="Times New Roman" w:eastAsia="Times New Roman" w:hAnsi="Times New Roman" w:cs="Times New Roman"/>
                 <w:sz w:val="20"/>
                 <w:szCs w:val="20"/>
-                <w:lang w:val="en-DE" w:eastAsia="en-DE"/>
+                <w:lang/>
               </w:rPr>
             </w:pPr>
-            <w:proofErr w:type="spellStart"/>
             <w:r>
               <w:rPr>
                 <w:rFonts w:ascii="Times New Roman" w:eastAsia="Times New Roman" w:hAnsi="Times New Roman" w:cs="Times New Roman"/>
                 <w:sz w:val="20"/>
                 <w:szCs w:val="20"/>
-                <w:lang w:val="en-DE" w:eastAsia="en-DE"/>
-              </w:rPr>
-              <w:t>Sawnwood</w:t>
-            </w:r>
-            <w:proofErr w:type="spellEnd"/>
-            <w:r>
-              <w:rPr>
-                <w:rFonts w:ascii="Times New Roman" w:eastAsia="Times New Roman" w:hAnsi="Times New Roman" w:cs="Times New Roman"/>
-                <w:sz w:val="20"/>
-                <w:szCs w:val="20"/>
-                <w:lang w:val="en-DE" w:eastAsia="en-DE"/>
-              </w:rPr>
-              <w:t xml:space="preserve"> Coniferous</w:t>
+                <w:lang/>
+              </w:rPr>
+              <w:t>Sawnwood Coniferous</w:t>
             </w:r>
           </w:p>
         </w:tc>
@@ -2946,7 +2894,7 @@
                 <w:rFonts w:ascii="Times New Roman" w:eastAsia="Times New Roman" w:hAnsi="Times New Roman" w:cs="Times New Roman"/>
                 <w:sz w:val="20"/>
                 <w:szCs w:val="20"/>
-                <w:lang w:val="en-DE" w:eastAsia="en-DE"/>
+                <w:lang/>
               </w:rPr>
             </w:pPr>
             <w:r>
@@ -2954,7 +2902,7 @@
                 <w:rFonts w:ascii="Times New Roman" w:eastAsia="Times New Roman" w:hAnsi="Times New Roman" w:cs="Times New Roman"/>
                 <w:sz w:val="20"/>
                 <w:szCs w:val="20"/>
-                <w:lang w:val="en-DE" w:eastAsia="en-DE"/>
+                <w:lang/>
               </w:rPr>
               <w:t>440710, 440711, 440712, 440713, 440714, 440719</w:t>
             </w:r>
@@ -2977,7 +2925,7 @@
                 <w:rFonts w:ascii="Times New Roman" w:eastAsia="Times New Roman" w:hAnsi="Times New Roman" w:cs="Times New Roman"/>
                 <w:sz w:val="20"/>
                 <w:szCs w:val="20"/>
-                <w:lang w:val="en-DE" w:eastAsia="en-DE"/>
+                <w:lang/>
               </w:rPr>
             </w:pPr>
             <w:r>
@@ -2985,7 +2933,7 @@
                 <w:rFonts w:ascii="Times New Roman" w:eastAsia="Times New Roman" w:hAnsi="Times New Roman" w:cs="Times New Roman"/>
                 <w:sz w:val="20"/>
                 <w:szCs w:val="20"/>
-                <w:lang w:val="en-DE" w:eastAsia="en-DE"/>
+                <w:lang/>
               </w:rPr>
               <w:t>Veneer and Plywood</w:t>
             </w:r>
@@ -3004,7 +2952,7 @@
                 <w:rFonts w:ascii="Times New Roman" w:eastAsia="Times New Roman" w:hAnsi="Times New Roman" w:cs="Times New Roman"/>
                 <w:sz w:val="20"/>
                 <w:szCs w:val="20"/>
-                <w:lang w:val="en-DE" w:eastAsia="en-DE"/>
+                <w:lang/>
               </w:rPr>
             </w:pPr>
             <w:r>
@@ -3012,7 +2960,7 @@
                 <w:rFonts w:ascii="Times New Roman" w:eastAsia="Times New Roman" w:hAnsi="Times New Roman" w:cs="Times New Roman"/>
                 <w:sz w:val="20"/>
                 <w:szCs w:val="20"/>
-                <w:lang w:val="en-DE" w:eastAsia="en-DE"/>
+                <w:lang/>
               </w:rPr>
               <w:t>4412</w:t>
             </w:r>
@@ -3035,7 +2983,7 @@
                 <w:rFonts w:ascii="Times New Roman" w:eastAsia="Times New Roman" w:hAnsi="Times New Roman" w:cs="Times New Roman"/>
                 <w:sz w:val="20"/>
                 <w:szCs w:val="20"/>
-                <w:lang w:val="en-DE" w:eastAsia="en-DE"/>
+                <w:lang/>
               </w:rPr>
             </w:pPr>
             <w:r>
@@ -3043,7 +2991,7 @@
                 <w:rFonts w:ascii="Times New Roman" w:eastAsia="Times New Roman" w:hAnsi="Times New Roman" w:cs="Times New Roman"/>
                 <w:sz w:val="20"/>
                 <w:szCs w:val="20"/>
-                <w:lang w:val="en-DE" w:eastAsia="en-DE"/>
+                <w:lang/>
               </w:rPr>
               <w:t>Particleboard</w:t>
             </w:r>
@@ -3062,7 +3010,7 @@
                 <w:rFonts w:ascii="Times New Roman" w:eastAsia="Times New Roman" w:hAnsi="Times New Roman" w:cs="Times New Roman"/>
                 <w:sz w:val="20"/>
                 <w:szCs w:val="20"/>
-                <w:lang w:val="en-DE" w:eastAsia="en-DE"/>
+                <w:lang/>
               </w:rPr>
             </w:pPr>
             <w:r>
@@ -3070,7 +3018,7 @@
                 <w:rFonts w:ascii="Times New Roman" w:eastAsia="Times New Roman" w:hAnsi="Times New Roman" w:cs="Times New Roman"/>
                 <w:sz w:val="20"/>
                 <w:szCs w:val="20"/>
-                <w:lang w:val="en-DE" w:eastAsia="en-DE"/>
+                <w:lang/>
               </w:rPr>
               <w:t>4410</w:t>
             </w:r>
@@ -3093,7 +3041,7 @@
                 <w:rFonts w:ascii="Times New Roman" w:eastAsia="Times New Roman" w:hAnsi="Times New Roman" w:cs="Times New Roman"/>
                 <w:sz w:val="20"/>
                 <w:szCs w:val="20"/>
-                <w:lang w:val="en-DE" w:eastAsia="en-DE"/>
+                <w:lang/>
               </w:rPr>
             </w:pPr>
             <w:r>
@@ -3101,7 +3049,7 @@
                 <w:rFonts w:ascii="Times New Roman" w:eastAsia="Times New Roman" w:hAnsi="Times New Roman" w:cs="Times New Roman"/>
                 <w:sz w:val="20"/>
                 <w:szCs w:val="20"/>
-                <w:lang w:val="en-DE" w:eastAsia="en-DE"/>
+                <w:lang/>
               </w:rPr>
               <w:t>Fibreboard</w:t>
             </w:r>
@@ -3120,7 +3068,7 @@
                 <w:rFonts w:ascii="Times New Roman" w:eastAsia="Times New Roman" w:hAnsi="Times New Roman" w:cs="Times New Roman"/>
                 <w:sz w:val="20"/>
                 <w:szCs w:val="20"/>
-                <w:lang w:val="en-DE" w:eastAsia="en-DE"/>
+                <w:lang/>
               </w:rPr>
             </w:pPr>
             <w:r>
@@ -3128,7 +3076,7 @@
                 <w:rFonts w:ascii="Times New Roman" w:eastAsia="Times New Roman" w:hAnsi="Times New Roman" w:cs="Times New Roman"/>
                 <w:sz w:val="20"/>
                 <w:szCs w:val="20"/>
-                <w:lang w:val="en-DE" w:eastAsia="en-DE"/>
+                <w:lang/>
               </w:rPr>
               <w:t>4411</w:t>
             </w:r>
@@ -3151,7 +3099,7 @@
                 <w:rFonts w:ascii="Times New Roman" w:eastAsia="Times New Roman" w:hAnsi="Times New Roman" w:cs="Times New Roman"/>
                 <w:sz w:val="20"/>
                 <w:szCs w:val="20"/>
-                <w:lang w:val="en-DE" w:eastAsia="en-DE"/>
+                <w:lang/>
               </w:rPr>
             </w:pPr>
             <w:r>
@@ -3159,7 +3107,7 @@
                 <w:rFonts w:ascii="Times New Roman" w:eastAsia="Times New Roman" w:hAnsi="Times New Roman" w:cs="Times New Roman"/>
                 <w:sz w:val="20"/>
                 <w:szCs w:val="20"/>
-                <w:lang w:val="en-DE" w:eastAsia="en-DE"/>
+                <w:lang/>
               </w:rPr>
               <w:t>Mechanical Pulp</w:t>
             </w:r>
@@ -3178,7 +3126,7 @@
                 <w:rFonts w:ascii="Times New Roman" w:eastAsia="Times New Roman" w:hAnsi="Times New Roman" w:cs="Times New Roman"/>
                 <w:sz w:val="20"/>
                 <w:szCs w:val="20"/>
-                <w:lang w:val="en-DE" w:eastAsia="en-DE"/>
+                <w:lang/>
               </w:rPr>
             </w:pPr>
             <w:r>
@@ -3186,7 +3134,7 @@
                 <w:rFonts w:ascii="Times New Roman" w:eastAsia="Times New Roman" w:hAnsi="Times New Roman" w:cs="Times New Roman"/>
                 <w:sz w:val="20"/>
                 <w:szCs w:val="20"/>
-                <w:lang w:val="en-DE" w:eastAsia="en-DE"/>
+                <w:lang/>
               </w:rPr>
               <w:t>4701</w:t>
             </w:r>
@@ -3209,7 +3157,7 @@
                 <w:rFonts w:ascii="Times New Roman" w:eastAsia="Times New Roman" w:hAnsi="Times New Roman" w:cs="Times New Roman"/>
                 <w:sz w:val="20"/>
                 <w:szCs w:val="20"/>
-                <w:lang w:val="en-DE" w:eastAsia="en-DE"/>
+                <w:lang/>
               </w:rPr>
             </w:pPr>
             <w:r>
@@ -3217,7 +3165,7 @@
                 <w:rFonts w:ascii="Times New Roman" w:eastAsia="Times New Roman" w:hAnsi="Times New Roman" w:cs="Times New Roman"/>
                 <w:sz w:val="20"/>
                 <w:szCs w:val="20"/>
-                <w:lang w:val="en-DE" w:eastAsia="en-DE"/>
+                <w:lang/>
               </w:rPr>
               <w:t>Chemical and Semi-chemical pulp</w:t>
             </w:r>
@@ -3236,7 +3184,7 @@
                 <w:rFonts w:ascii="Times New Roman" w:eastAsia="Times New Roman" w:hAnsi="Times New Roman" w:cs="Times New Roman"/>
                 <w:sz w:val="20"/>
                 <w:szCs w:val="20"/>
-                <w:lang w:val="en-DE" w:eastAsia="en-DE"/>
+                <w:lang/>
               </w:rPr>
             </w:pPr>
             <w:r>
@@ -3244,7 +3192,7 @@
                 <w:rFonts w:ascii="Times New Roman" w:eastAsia="Times New Roman" w:hAnsi="Times New Roman" w:cs="Times New Roman"/>
                 <w:sz w:val="20"/>
                 <w:szCs w:val="20"/>
-                <w:lang w:val="en-DE" w:eastAsia="en-DE"/>
+                <w:lang/>
               </w:rPr>
               <w:t>4703, 4704, 4705</w:t>
             </w:r>
@@ -3267,7 +3215,7 @@
                 <w:rFonts w:ascii="Times New Roman" w:eastAsia="Times New Roman" w:hAnsi="Times New Roman" w:cs="Times New Roman"/>
                 <w:sz w:val="20"/>
                 <w:szCs w:val="20"/>
-                <w:lang w:val="en-DE" w:eastAsia="en-DE"/>
+                <w:lang/>
               </w:rPr>
             </w:pPr>
             <w:r>
@@ -3275,7 +3223,7 @@
                 <w:rFonts w:ascii="Times New Roman" w:eastAsia="Times New Roman" w:hAnsi="Times New Roman" w:cs="Times New Roman"/>
                 <w:sz w:val="20"/>
                 <w:szCs w:val="20"/>
-                <w:lang w:val="en-DE" w:eastAsia="en-DE"/>
+                <w:lang/>
               </w:rPr>
               <w:t>Other Fibre Pulp</w:t>
             </w:r>
@@ -3294,7 +3242,7 @@
                 <w:rFonts w:ascii="Times New Roman" w:eastAsia="Times New Roman" w:hAnsi="Times New Roman" w:cs="Times New Roman"/>
                 <w:sz w:val="20"/>
                 <w:szCs w:val="20"/>
-                <w:lang w:val="en-DE" w:eastAsia="en-DE"/>
+                <w:lang/>
               </w:rPr>
             </w:pPr>
             <w:r>
@@ -3302,7 +3250,7 @@
                 <w:rFonts w:ascii="Times New Roman" w:eastAsia="Times New Roman" w:hAnsi="Times New Roman" w:cs="Times New Roman"/>
                 <w:sz w:val="20"/>
                 <w:szCs w:val="20"/>
-                <w:lang w:val="en-DE" w:eastAsia="en-DE"/>
+                <w:lang/>
               </w:rPr>
               <w:t>4706</w:t>
             </w:r>
@@ -3325,7 +3273,7 @@
                 <w:rFonts w:ascii="Times New Roman" w:eastAsia="Times New Roman" w:hAnsi="Times New Roman" w:cs="Times New Roman"/>
                 <w:sz w:val="20"/>
                 <w:szCs w:val="20"/>
-                <w:lang w:val="en-DE" w:eastAsia="en-DE"/>
+                <w:lang/>
               </w:rPr>
             </w:pPr>
             <w:r>
@@ -3333,7 +3281,7 @@
                 <w:rFonts w:ascii="Times New Roman" w:eastAsia="Times New Roman" w:hAnsi="Times New Roman" w:cs="Times New Roman"/>
                 <w:sz w:val="20"/>
                 <w:szCs w:val="20"/>
-                <w:lang w:val="en-DE" w:eastAsia="en-DE"/>
+                <w:lang/>
               </w:rPr>
               <w:t>Waste Paper</w:t>
             </w:r>
@@ -3352,7 +3300,7 @@
                 <w:rFonts w:ascii="Times New Roman" w:eastAsia="Times New Roman" w:hAnsi="Times New Roman" w:cs="Times New Roman"/>
                 <w:sz w:val="20"/>
                 <w:szCs w:val="20"/>
-                <w:lang w:val="en-DE" w:eastAsia="en-DE"/>
+                <w:lang/>
               </w:rPr>
             </w:pPr>
             <w:r>
@@ -3360,7 +3308,7 @@
                 <w:rFonts w:ascii="Times New Roman" w:eastAsia="Times New Roman" w:hAnsi="Times New Roman" w:cs="Times New Roman"/>
                 <w:sz w:val="20"/>
                 <w:szCs w:val="20"/>
-                <w:lang w:val="en-DE" w:eastAsia="en-DE"/>
+                <w:lang/>
               </w:rPr>
               <w:t>4707</w:t>
             </w:r>
@@ -3383,7 +3331,7 @@
                 <w:rFonts w:ascii="Times New Roman" w:eastAsia="Times New Roman" w:hAnsi="Times New Roman" w:cs="Times New Roman"/>
                 <w:sz w:val="20"/>
                 <w:szCs w:val="20"/>
-                <w:lang w:val="en-DE" w:eastAsia="en-DE"/>
+                <w:lang/>
               </w:rPr>
             </w:pPr>
             <w:r>
@@ -3391,7 +3339,7 @@
                 <w:rFonts w:ascii="Times New Roman" w:eastAsia="Times New Roman" w:hAnsi="Times New Roman" w:cs="Times New Roman"/>
                 <w:sz w:val="20"/>
                 <w:szCs w:val="20"/>
-                <w:lang w:val="en-DE" w:eastAsia="en-DE"/>
+                <w:lang/>
               </w:rPr>
               <w:t>Newsprint</w:t>
             </w:r>
@@ -3410,7 +3358,7 @@
                 <w:rFonts w:ascii="Times New Roman" w:eastAsia="Times New Roman" w:hAnsi="Times New Roman" w:cs="Times New Roman"/>
                 <w:sz w:val="20"/>
                 <w:szCs w:val="20"/>
-                <w:lang w:val="en-DE" w:eastAsia="en-DE"/>
+                <w:lang/>
               </w:rPr>
             </w:pPr>
             <w:r>
@@ -3418,7 +3366,7 @@
                 <w:rFonts w:ascii="Times New Roman" w:eastAsia="Times New Roman" w:hAnsi="Times New Roman" w:cs="Times New Roman"/>
                 <w:sz w:val="20"/>
                 <w:szCs w:val="20"/>
-                <w:lang w:val="en-DE" w:eastAsia="en-DE"/>
+                <w:lang/>
               </w:rPr>
               <w:t>480100</w:t>
             </w:r>
@@ -3441,7 +3389,7 @@
                 <w:rFonts w:ascii="Times New Roman" w:eastAsia="Times New Roman" w:hAnsi="Times New Roman" w:cs="Times New Roman"/>
                 <w:sz w:val="20"/>
                 <w:szCs w:val="20"/>
-                <w:lang w:val="en-DE" w:eastAsia="en-DE"/>
+                <w:lang/>
               </w:rPr>
             </w:pPr>
             <w:r>
@@ -3449,7 +3397,7 @@
                 <w:rFonts w:ascii="Times New Roman" w:eastAsia="Times New Roman" w:hAnsi="Times New Roman" w:cs="Times New Roman"/>
                 <w:sz w:val="20"/>
                 <w:szCs w:val="20"/>
-                <w:lang w:val="en-DE" w:eastAsia="en-DE"/>
+                <w:lang/>
               </w:rPr>
               <w:t>PWP</w:t>
             </w:r>
@@ -3468,7 +3416,7 @@
                 <w:rFonts w:ascii="Times New Roman" w:eastAsia="Times New Roman" w:hAnsi="Times New Roman" w:cs="Times New Roman"/>
                 <w:sz w:val="20"/>
                 <w:szCs w:val="20"/>
-                <w:lang w:val="en-DE" w:eastAsia="en-DE"/>
+                <w:lang/>
               </w:rPr>
             </w:pPr>
             <w:r>
@@ -3476,7 +3424,7 @@
                 <w:rFonts w:ascii="Times New Roman" w:eastAsia="Times New Roman" w:hAnsi="Times New Roman" w:cs="Times New Roman"/>
                 <w:sz w:val="20"/>
                 <w:szCs w:val="20"/>
-                <w:lang w:val="en-DE" w:eastAsia="en-DE"/>
+                <w:lang/>
               </w:rPr>
               <w:t>4802</w:t>
             </w:r>
@@ -3499,7 +3447,7 @@
                 <w:rFonts w:ascii="Times New Roman" w:eastAsia="Times New Roman" w:hAnsi="Times New Roman" w:cs="Times New Roman"/>
                 <w:sz w:val="20"/>
                 <w:szCs w:val="20"/>
-                <w:lang w:val="en-DE" w:eastAsia="en-DE"/>
+                <w:lang/>
               </w:rPr>
             </w:pPr>
             <w:r>
@@ -3507,7 +3455,7 @@
                 <w:rFonts w:ascii="Times New Roman" w:eastAsia="Times New Roman" w:hAnsi="Times New Roman" w:cs="Times New Roman"/>
                 <w:sz w:val="20"/>
                 <w:szCs w:val="20"/>
-                <w:lang w:val="en-DE" w:eastAsia="en-DE"/>
+                <w:lang/>
               </w:rPr>
               <w:t xml:space="preserve">Paper and </w:t>
             </w:r>
@@ -3516,21 +3464,19 @@
                 <w:rFonts w:ascii="Times New Roman" w:eastAsia="Times New Roman" w:hAnsi="Times New Roman" w:cs="Times New Roman"/>
                 <w:sz w:val="20"/>
                 <w:szCs w:val="20"/>
-                <w:lang w:val="en-US" w:eastAsia="en-DE"/>
+                <w:lang w:val="en-US"/>
               </w:rPr>
               <w:t>P</w:t>
             </w:r>
-            <w:proofErr w:type="spellStart"/>
             <w:r>
               <w:rPr>
                 <w:rFonts w:ascii="Times New Roman" w:eastAsia="Times New Roman" w:hAnsi="Times New Roman" w:cs="Times New Roman"/>
                 <w:sz w:val="20"/>
                 <w:szCs w:val="20"/>
-                <w:lang w:val="en-DE" w:eastAsia="en-DE"/>
+                <w:lang/>
               </w:rPr>
               <w:t>aperboard</w:t>
             </w:r>
-            <w:proofErr w:type="spellEnd"/>
           </w:p>
         </w:tc>
         <w:tc>
@@ -3546,7 +3492,7 @@
                 <w:rFonts w:ascii="Times New Roman" w:eastAsia="Times New Roman" w:hAnsi="Times New Roman" w:cs="Times New Roman"/>
                 <w:sz w:val="20"/>
                 <w:szCs w:val="20"/>
-                <w:lang w:val="en-DE" w:eastAsia="en-DE"/>
+                <w:lang/>
               </w:rPr>
             </w:pPr>
             <w:r>
@@ -3554,7 +3500,7 @@
                 <w:rFonts w:ascii="Times New Roman" w:eastAsia="Times New Roman" w:hAnsi="Times New Roman" w:cs="Times New Roman"/>
                 <w:sz w:val="20"/>
                 <w:szCs w:val="20"/>
-                <w:lang w:val="en-DE" w:eastAsia="en-DE"/>
+                <w:lang/>
               </w:rPr>
               <w:t>4804, 4805, 480620, 480630, 480640, 4807, 4808, 4810, 4811, 481500, 4819, 4821, 4823</w:t>
             </w:r>
@@ -3577,7 +3523,7 @@
           <w:lang w:val="en-US"/>
         </w:rPr>
         <w:sectPr>
-          <w:footerReference w:type="default" r:id="rId6"/>
+          <w:footerReference w:type="default" r:id="rId8"/>
           <w:pgSz w:w="11906" w:h="16838"/>
           <w:pgMar w:top="1417" w:right="1417" w:bottom="1134" w:left="1417" w:header="708" w:footer="708" w:gutter="0"/>
           <w:cols w:space="708"/>
@@ -3588,12 +3534,43 @@
     <w:p>
       <w:pPr>
         <w:pStyle w:val="Heading1"/>
+        <w:rPr>
+          <w:lang w:val="en-US"/>
+        </w:rPr>
       </w:pPr>
       <w:bookmarkStart w:id="7" w:name="_Toc191022862"/>
       <w:r>
-        <w:t>Data Extraction and Calculation for Forest Growing Stock and Forest Stock Growth</w:t>
+        <w:lastRenderedPageBreak/>
+        <w:t>Data Extraction and Calculation for Forest Growing Stock a</w:t>
+      </w:r>
+      <w:r>
+        <w:rPr>
+          <w:lang w:val="en-US"/>
+        </w:rPr>
+        <w:t xml:space="preserve">s </w:t>
+      </w:r>
+      <w:r>
+        <w:rPr>
+          <w:lang w:val="en-US"/>
+        </w:rPr>
+        <w:t>well as</w:t>
+      </w:r>
+      <w:r>
+        <w:t xml:space="preserve"> Forest Stock Growth</w:t>
       </w:r>
       <w:bookmarkEnd w:id="7"/>
+      <w:r>
+        <w:rPr>
+          <w:lang w:val="en-US"/>
+        </w:rPr>
+        <w:t xml:space="preserve"> </w:t>
+      </w:r>
+      <w:r>
+        <w:rPr>
+          <w:lang w:val="en-US"/>
+        </w:rPr>
+        <w:t>and Forest Area and Forest Area Growth</w:t>
+      </w:r>
     </w:p>
     <w:p>
       <w:pPr>
@@ -3626,36 +3603,65 @@
         <w:pStyle w:val="NormalWeb"/>
       </w:pPr>
       <w:r>
-        <w:t xml:space="preserve">This dataset contains information on forest growing stock and forest stock growth for 180 countries, as considered in the </w:t>
+        <w:t>This dataset contains information on forest growing stock and forest stock growth</w:t>
+      </w:r>
+      <w:r>
+        <w:rPr>
+          <w:lang w:val="en-US"/>
+        </w:rPr>
+        <w:t xml:space="preserve"> </w:t>
+      </w:r>
+      <w:r>
+        <w:rPr>
+          <w:lang w:val="en-US"/>
+        </w:rPr>
+        <w:t>as well as forest area and forest area growth</w:t>
+      </w:r>
+      <w:r>
+        <w:t xml:space="preserve"> for 180 countries, as considered in the TiMBA model. While data on forest area and forest </w:t>
+      </w:r>
+      <w:r>
+        <w:rPr>
+          <w:lang w:val="en-US"/>
+        </w:rPr>
+        <w:t>area growth</w:t>
+      </w:r>
+      <w:r>
+        <w:t xml:space="preserve"> for the reporting year 2020 is adequately provided by the </w:t>
+      </w:r>
+      <w:r>
+        <w:rPr>
+          <w:lang w:val="en-US"/>
+        </w:rPr>
+        <w:t xml:space="preserve">FAO </w:t>
+      </w:r>
+      <w:r>
+        <w:rPr>
+          <w:rStyle w:val="Strong"/>
+        </w:rPr>
+        <w:t>F</w:t>
       </w:r>
       <w:proofErr w:type="spellStart"/>
       <w:r>
-        <w:t>TiMBA</w:t>
+        <w:rPr>
+          <w:rStyle w:val="Strong"/>
+          <w:lang w:val="en-US"/>
+        </w:rPr>
+        <w:t>orest</w:t>
       </w:r>
       <w:proofErr w:type="spellEnd"/>
       <w:r>
-        <w:t xml:space="preserve"> model. While data on forest area and forest </w:t>
-      </w:r>
-      <w:r>
-        <w:rPr>
-          <w:lang w:val="en-US"/>
-        </w:rPr>
-        <w:t>area growth</w:t>
-      </w:r>
-      <w:r>
-        <w:t xml:space="preserve"> for the reporting year 2020 is adequately provided by the </w:t>
-      </w:r>
-      <w:r>
-        <w:rPr>
-          <w:lang w:val="en-US"/>
-        </w:rPr>
-        <w:t xml:space="preserve">FAO </w:t>
-      </w:r>
-      <w:r>
         <w:rPr>
           <w:rStyle w:val="Strong"/>
-        </w:rPr>
-        <w:t>F</w:t>
+          <w:lang w:val="en-US"/>
+        </w:rPr>
+        <w:t xml:space="preserve"> </w:t>
+      </w:r>
+      <w:r>
+        <w:rPr>
+          <w:rStyle w:val="Strong"/>
+        </w:rPr>
+        <w:t>R</w:t>
       </w:r>
       <w:proofErr w:type="spellStart"/>
       <w:r>
@@ -3663,7 +3669,7 @@
           <w:rStyle w:val="Strong"/>
           <w:lang w:val="en-US"/>
         </w:rPr>
-        <w:t>orest</w:t>
+        <w:t>esources</w:t>
       </w:r>
       <w:proofErr w:type="spellEnd"/>
       <w:r>
@@ -3677,7 +3683,7 @@
         <w:rPr>
           <w:rStyle w:val="Strong"/>
         </w:rPr>
-        <w:t>R</w:t>
+        <w:t>A</w:t>
       </w:r>
       <w:proofErr w:type="spellStart"/>
       <w:r>
@@ -3685,7 +3691,7 @@
           <w:rStyle w:val="Strong"/>
           <w:lang w:val="en-US"/>
         </w:rPr>
-        <w:t>esources</w:t>
+        <w:t>ssessment</w:t>
       </w:r>
       <w:proofErr w:type="spellEnd"/>
       <w:r>
@@ -3693,34 +3699,12 @@
           <w:rStyle w:val="Strong"/>
           <w:lang w:val="en-US"/>
         </w:rPr>
-        <w:t xml:space="preserve"> </w:t>
+        <w:t xml:space="preserve"> (FRA)</w:t>
       </w:r>
       <w:r>
         <w:rPr>
           <w:rStyle w:val="Strong"/>
         </w:rPr>
-        <w:t>A</w:t>
-      </w:r>
-      <w:proofErr w:type="spellStart"/>
-      <w:r>
-        <w:rPr>
-          <w:rStyle w:val="Strong"/>
-          <w:lang w:val="en-US"/>
-        </w:rPr>
-        <w:t>ssessment</w:t>
-      </w:r>
-      <w:proofErr w:type="spellEnd"/>
-      <w:r>
-        <w:rPr>
-          <w:rStyle w:val="Strong"/>
-          <w:lang w:val="en-US"/>
-        </w:rPr>
-        <w:t xml:space="preserve"> (FRA)</w:t>
-      </w:r>
-      <w:r>
-        <w:rPr>
-          <w:rStyle w:val="Strong"/>
-        </w:rPr>
         <w:t xml:space="preserve"> 2020</w:t>
       </w:r>
       <w:r>
@@ -3769,15 +3753,7 @@
         <w:t xml:space="preserve"> The</w:t>
       </w:r>
       <w:r>
-        <w:t xml:space="preserve"> methodology ensures that the data used in the </w:t>
-      </w:r>
-      <w:proofErr w:type="spellStart"/>
-      <w:r>
-        <w:t>TiMBA</w:t>
-      </w:r>
-      <w:proofErr w:type="spellEnd"/>
-      <w:r>
-        <w:t xml:space="preserve"> model is as consistent and reliable as possible, despite the fragmented nature of global forest stock data.</w:t>
+        <w:t xml:space="preserve"> methodology ensures that the data used in the TiMBA model is as consistent and reliable as possible, despite the fragmented nature of global forest stock data.</w:t>
       </w:r>
     </w:p>
     <w:p>
@@ -3794,14 +3770,7 @@
           <w:rFonts w:ascii="Times New Roman" w:hAnsi="Times New Roman" w:cs="Times New Roman"/>
           <w:lang w:val="en-US"/>
         </w:rPr>
-        <w:t>2.</w:t>
-      </w:r>
-      <w:r>
-        <w:rPr>
-          <w:rFonts w:ascii="Times New Roman" w:hAnsi="Times New Roman" w:cs="Times New Roman"/>
-          <w:lang w:val="en-US"/>
-        </w:rPr>
-        <w:t xml:space="preserve"> </w:t>
+        <w:t xml:space="preserve">2. </w:t>
       </w:r>
       <w:r>
         <w:rPr>
@@ -3822,21 +3791,7 @@
           <w:rFonts w:ascii="Times New Roman" w:hAnsi="Times New Roman" w:cs="Times New Roman"/>
           <w:lang w:val="en-US"/>
         </w:rPr>
-        <w:t>Extraction and</w:t>
-      </w:r>
-      <w:r>
-        <w:rPr>
-          <w:rFonts w:ascii="Times New Roman" w:hAnsi="Times New Roman" w:cs="Times New Roman"/>
-          <w:lang w:val="en-US"/>
-        </w:rPr>
-        <w:t xml:space="preserve"> Calculation </w:t>
-      </w:r>
-      <w:r>
-        <w:rPr>
-          <w:rFonts w:ascii="Times New Roman" w:hAnsi="Times New Roman" w:cs="Times New Roman"/>
-          <w:lang w:val="en-US"/>
-        </w:rPr>
-        <w:t>of Data</w:t>
+        <w:t>Extraction and Calculation of Data</w:t>
       </w:r>
       <w:bookmarkEnd w:id="9"/>
     </w:p>
@@ -3847,7 +3802,7 @@
           <w:rFonts w:ascii="Times New Roman" w:eastAsia="Times New Roman" w:hAnsi="Times New Roman" w:cs="Times New Roman"/>
           <w:sz w:val="24"/>
           <w:szCs w:val="24"/>
-          <w:lang w:val="en-US" w:eastAsia="en-DE"/>
+          <w:lang w:val="en-US"/>
         </w:rPr>
       </w:pPr>
       <w:r>
@@ -3855,72 +3810,61 @@
           <w:rFonts w:ascii="Times New Roman" w:eastAsia="Times New Roman" w:hAnsi="Times New Roman" w:cs="Times New Roman"/>
           <w:sz w:val="24"/>
           <w:szCs w:val="24"/>
-          <w:lang w:val="en-US" w:eastAsia="en-DE"/>
+          <w:lang w:val="en-US"/>
         </w:rPr>
         <w:t>Whenever available, d</w:t>
       </w:r>
-      <w:proofErr w:type="spellStart"/>
       <w:r>
         <w:rPr>
           <w:rFonts w:ascii="Times New Roman" w:eastAsia="Times New Roman" w:hAnsi="Times New Roman" w:cs="Times New Roman"/>
           <w:sz w:val="24"/>
           <w:szCs w:val="24"/>
-          <w:lang w:val="en-DE" w:eastAsia="en-DE"/>
-        </w:rPr>
-        <w:t>ata</w:t>
-      </w:r>
-      <w:proofErr w:type="spellEnd"/>
+          <w:lang/>
+        </w:rPr>
+        <w:t xml:space="preserve">ata </w:t>
+      </w:r>
       <w:r>
         <w:rPr>
           <w:rFonts w:ascii="Times New Roman" w:eastAsia="Times New Roman" w:hAnsi="Times New Roman" w:cs="Times New Roman"/>
           <w:sz w:val="24"/>
           <w:szCs w:val="24"/>
-          <w:lang w:val="en-DE" w:eastAsia="en-DE"/>
-        </w:rPr>
-        <w:t xml:space="preserve"> </w:t>
+          <w:lang w:val="en-US"/>
+        </w:rPr>
+        <w:t>for the country-specific</w:t>
       </w:r>
       <w:r>
         <w:rPr>
           <w:rFonts w:ascii="Times New Roman" w:eastAsia="Times New Roman" w:hAnsi="Times New Roman" w:cs="Times New Roman"/>
           <w:sz w:val="24"/>
           <w:szCs w:val="24"/>
-          <w:lang w:val="en-US" w:eastAsia="en-DE"/>
-        </w:rPr>
-        <w:t>for the country-specific</w:t>
+          <w:lang/>
+        </w:rPr>
+        <w:t xml:space="preserve"> </w:t>
+      </w:r>
+      <w:r>
+        <w:rPr>
+          <w:rFonts w:ascii="Times New Roman" w:hAnsi="Times New Roman" w:cs="Times New Roman"/>
+          <w:b/>
+          <w:bCs/>
+          <w:lang w:val="en-US"/>
+        </w:rPr>
+        <w:t xml:space="preserve">growing stock for the total forest area </w:t>
       </w:r>
       <w:r>
         <w:rPr>
           <w:rFonts w:ascii="Times New Roman" w:eastAsia="Times New Roman" w:hAnsi="Times New Roman" w:cs="Times New Roman"/>
           <w:sz w:val="24"/>
           <w:szCs w:val="24"/>
-          <w:lang w:val="en-DE" w:eastAsia="en-DE"/>
-        </w:rPr>
-        <w:t xml:space="preserve"> </w:t>
-      </w:r>
-      <w:r>
-        <w:rPr>
-          <w:rFonts w:ascii="Times New Roman" w:hAnsi="Times New Roman" w:cs="Times New Roman"/>
-          <w:b/>
-          <w:bCs/>
-          <w:lang w:val="en-US"/>
-        </w:rPr>
-        <w:t xml:space="preserve">growing stock for the total forest area </w:t>
+          <w:lang/>
+        </w:rPr>
+        <w:t>was taken from the</w:t>
       </w:r>
       <w:r>
         <w:rPr>
           <w:rFonts w:ascii="Times New Roman" w:eastAsia="Times New Roman" w:hAnsi="Times New Roman" w:cs="Times New Roman"/>
           <w:sz w:val="24"/>
           <w:szCs w:val="24"/>
-          <w:lang w:val="en-DE" w:eastAsia="en-DE"/>
-        </w:rPr>
-        <w:t>was taken from the</w:t>
-      </w:r>
-      <w:r>
-        <w:rPr>
-          <w:rFonts w:ascii="Times New Roman" w:eastAsia="Times New Roman" w:hAnsi="Times New Roman" w:cs="Times New Roman"/>
-          <w:sz w:val="24"/>
-          <w:szCs w:val="24"/>
-          <w:lang w:val="en-US" w:eastAsia="en-DE"/>
+          <w:lang w:val="en-US"/>
         </w:rPr>
         <w:t xml:space="preserve"> </w:t>
       </w:r>
@@ -3931,7 +3875,7 @@
           <w:bCs/>
           <w:sz w:val="24"/>
           <w:szCs w:val="24"/>
-          <w:lang w:val="en-US" w:eastAsia="en-DE"/>
+          <w:lang w:val="en-US"/>
         </w:rPr>
         <w:t>FRA 2020</w:t>
       </w:r>
@@ -3940,7 +3884,7 @@
           <w:rFonts w:ascii="Times New Roman" w:eastAsia="Times New Roman" w:hAnsi="Times New Roman" w:cs="Times New Roman"/>
           <w:sz w:val="24"/>
           <w:szCs w:val="24"/>
-          <w:lang w:val="en-US" w:eastAsia="en-DE"/>
+          <w:lang w:val="en-US"/>
         </w:rPr>
         <w:t xml:space="preserve"> (</w:t>
       </w:r>
@@ -3949,7 +3893,7 @@
           <w:rFonts w:ascii="Times New Roman" w:eastAsia="Times New Roman" w:hAnsi="Times New Roman" w:cs="Times New Roman"/>
           <w:sz w:val="24"/>
           <w:szCs w:val="24"/>
-          <w:lang w:val="en-US" w:eastAsia="en-DE"/>
+          <w:lang w:val="en-US"/>
         </w:rPr>
         <w:t>FAO 2022</w:t>
       </w:r>
@@ -3958,7 +3902,7 @@
           <w:rFonts w:ascii="Times New Roman" w:eastAsia="Times New Roman" w:hAnsi="Times New Roman" w:cs="Times New Roman"/>
           <w:sz w:val="24"/>
           <w:szCs w:val="24"/>
-          <w:lang w:val="en-DE" w:eastAsia="en-DE"/>
+          <w:lang/>
         </w:rPr>
         <w:t>)</w:t>
       </w:r>
@@ -3967,7 +3911,7 @@
           <w:rFonts w:ascii="Times New Roman" w:eastAsia="Times New Roman" w:hAnsi="Times New Roman" w:cs="Times New Roman"/>
           <w:sz w:val="24"/>
           <w:szCs w:val="24"/>
-          <w:lang w:val="en-US" w:eastAsia="en-DE"/>
+          <w:lang w:val="en-US"/>
         </w:rPr>
         <w:t xml:space="preserve"> </w:t>
       </w:r>
@@ -3976,7 +3920,7 @@
           <w:rFonts w:ascii="Times New Roman" w:eastAsia="Times New Roman" w:hAnsi="Times New Roman" w:cs="Times New Roman"/>
           <w:sz w:val="24"/>
           <w:szCs w:val="24"/>
-          <w:lang w:val="en-DE" w:eastAsia="en-DE"/>
+          <w:lang/>
         </w:rPr>
         <w:t>for the reporting year 2020. This data provides the most up-to-date estimates for forest stock at a global level.</w:t>
       </w:r>
@@ -3985,7 +3929,7 @@
           <w:rFonts w:ascii="Times New Roman" w:eastAsia="Times New Roman" w:hAnsi="Times New Roman" w:cs="Times New Roman"/>
           <w:sz w:val="24"/>
           <w:szCs w:val="24"/>
-          <w:lang w:val="en-US" w:eastAsia="en-DE"/>
+          <w:lang w:val="en-US"/>
         </w:rPr>
         <w:t xml:space="preserve"> </w:t>
       </w:r>
@@ -3997,7 +3941,7 @@
           <w:rFonts w:ascii="Times New Roman" w:eastAsia="Times New Roman" w:hAnsi="Times New Roman" w:cs="Times New Roman"/>
           <w:sz w:val="24"/>
           <w:szCs w:val="24"/>
-          <w:lang w:val="en-US" w:eastAsia="en-DE"/>
+          <w:lang w:val="en-US"/>
         </w:rPr>
       </w:pPr>
       <w:r>
@@ -4005,7 +3949,7 @@
           <w:rFonts w:ascii="Times New Roman" w:eastAsia="Times New Roman" w:hAnsi="Times New Roman" w:cs="Times New Roman"/>
           <w:sz w:val="24"/>
           <w:szCs w:val="24"/>
-          <w:lang w:val="en-DE" w:eastAsia="en-DE"/>
+          <w:lang/>
         </w:rPr>
         <w:t xml:space="preserve">In cases where </w:t>
       </w:r>
@@ -4014,7 +3958,7 @@
           <w:rFonts w:ascii="Times New Roman" w:eastAsia="Times New Roman" w:hAnsi="Times New Roman" w:cs="Times New Roman"/>
           <w:sz w:val="24"/>
           <w:szCs w:val="24"/>
-          <w:lang w:val="en-US" w:eastAsia="en-DE"/>
+          <w:lang w:val="en-US"/>
         </w:rPr>
         <w:t>data for</w:t>
       </w:r>
@@ -4023,7 +3967,7 @@
           <w:rFonts w:ascii="Times New Roman" w:eastAsia="Times New Roman" w:hAnsi="Times New Roman" w:cs="Times New Roman"/>
           <w:sz w:val="24"/>
           <w:szCs w:val="24"/>
-          <w:lang w:val="en-DE" w:eastAsia="en-DE"/>
+          <w:lang/>
         </w:rPr>
         <w:t xml:space="preserve"> 2020</w:t>
       </w:r>
@@ -4032,7 +3976,7 @@
           <w:rFonts w:ascii="Times New Roman" w:eastAsia="Times New Roman" w:hAnsi="Times New Roman" w:cs="Times New Roman"/>
           <w:sz w:val="24"/>
           <w:szCs w:val="24"/>
-          <w:lang w:val="en-US" w:eastAsia="en-DE"/>
+          <w:lang w:val="en-US"/>
         </w:rPr>
         <w:t xml:space="preserve"> </w:t>
       </w:r>
@@ -4041,7 +3985,7 @@
           <w:rFonts w:ascii="Times New Roman" w:eastAsia="Times New Roman" w:hAnsi="Times New Roman" w:cs="Times New Roman"/>
           <w:sz w:val="24"/>
           <w:szCs w:val="24"/>
-          <w:lang w:val="en-DE" w:eastAsia="en-DE"/>
+          <w:lang/>
         </w:rPr>
         <w:t>was not</w:t>
       </w:r>
@@ -4050,7 +3994,7 @@
           <w:rFonts w:ascii="Times New Roman" w:eastAsia="Times New Roman" w:hAnsi="Times New Roman" w:cs="Times New Roman"/>
           <w:sz w:val="24"/>
           <w:szCs w:val="24"/>
-          <w:lang w:val="en-US" w:eastAsia="en-DE"/>
+          <w:lang w:val="en-US"/>
         </w:rPr>
         <w:t xml:space="preserve"> </w:t>
       </w:r>
@@ -4059,7 +4003,7 @@
           <w:rFonts w:ascii="Times New Roman" w:eastAsia="Times New Roman" w:hAnsi="Times New Roman" w:cs="Times New Roman"/>
           <w:sz w:val="24"/>
           <w:szCs w:val="24"/>
-          <w:lang w:val="en-US" w:eastAsia="en-DE"/>
+          <w:lang w:val="en-US"/>
         </w:rPr>
         <w:t xml:space="preserve">reported but older data for </w:t>
       </w:r>
@@ -4068,7 +4012,7 @@
           <w:rFonts w:ascii="Times New Roman" w:eastAsia="Times New Roman" w:hAnsi="Times New Roman" w:cs="Times New Roman"/>
           <w:sz w:val="24"/>
           <w:szCs w:val="24"/>
-          <w:lang w:val="en-DE" w:eastAsia="en-DE"/>
+          <w:lang/>
         </w:rPr>
         <w:t>forest growing stock data for the total forest area (e.g., from 2010)</w:t>
       </w:r>
@@ -4077,7 +4021,7 @@
           <w:rFonts w:ascii="Times New Roman" w:eastAsia="Times New Roman" w:hAnsi="Times New Roman" w:cs="Times New Roman"/>
           <w:sz w:val="24"/>
           <w:szCs w:val="24"/>
-          <w:lang w:val="en-US" w:eastAsia="en-DE"/>
+          <w:lang w:val="en-US"/>
         </w:rPr>
         <w:t xml:space="preserve"> </w:t>
       </w:r>
@@ -4086,191 +4030,182 @@
           <w:rFonts w:ascii="Times New Roman" w:eastAsia="Times New Roman" w:hAnsi="Times New Roman" w:cs="Times New Roman"/>
           <w:sz w:val="24"/>
           <w:szCs w:val="24"/>
-          <w:lang w:val="en-US" w:eastAsia="en-DE"/>
-        </w:rPr>
-        <w:t>was available</w:t>
+          <w:lang w:val="en-US"/>
+        </w:rPr>
+        <w:t xml:space="preserve">was available, </w:t>
       </w:r>
       <w:r>
         <w:rPr>
           <w:rFonts w:ascii="Times New Roman" w:eastAsia="Times New Roman" w:hAnsi="Times New Roman" w:cs="Times New Roman"/>
           <w:sz w:val="24"/>
           <w:szCs w:val="24"/>
-          <w:lang w:val="en-US" w:eastAsia="en-DE"/>
-        </w:rPr>
-        <w:t xml:space="preserve">, </w:t>
+          <w:lang w:val="en-US"/>
+        </w:rPr>
+        <w:t xml:space="preserve">we used them to </w:t>
       </w:r>
       <w:r>
         <w:rPr>
           <w:rFonts w:ascii="Times New Roman" w:eastAsia="Times New Roman" w:hAnsi="Times New Roman" w:cs="Times New Roman"/>
           <w:sz w:val="24"/>
           <w:szCs w:val="24"/>
-          <w:lang w:val="en-US" w:eastAsia="en-DE"/>
-        </w:rPr>
-        <w:t xml:space="preserve">we used them to </w:t>
+          <w:lang/>
+        </w:rPr>
+        <w:t xml:space="preserve">fill in gaps where more recent data </w:t>
       </w:r>
       <w:r>
         <w:rPr>
           <w:rFonts w:ascii="Times New Roman" w:eastAsia="Times New Roman" w:hAnsi="Times New Roman" w:cs="Times New Roman"/>
           <w:sz w:val="24"/>
           <w:szCs w:val="24"/>
-          <w:lang w:val="en-DE" w:eastAsia="en-DE"/>
-        </w:rPr>
-        <w:t xml:space="preserve">fill in gaps where more recent data </w:t>
+          <w:lang w:val="en-US"/>
+        </w:rPr>
+        <w:t>are</w:t>
       </w:r>
       <w:r>
         <w:rPr>
           <w:rFonts w:ascii="Times New Roman" w:eastAsia="Times New Roman" w:hAnsi="Times New Roman" w:cs="Times New Roman"/>
           <w:sz w:val="24"/>
           <w:szCs w:val="24"/>
-          <w:lang w:val="en-US" w:eastAsia="en-DE"/>
-        </w:rPr>
-        <w:t>are</w:t>
+          <w:lang/>
+        </w:rPr>
+        <w:t xml:space="preserve"> unavailable.</w:t>
       </w:r>
       <w:r>
         <w:rPr>
           <w:rFonts w:ascii="Times New Roman" w:eastAsia="Times New Roman" w:hAnsi="Times New Roman" w:cs="Times New Roman"/>
           <w:sz w:val="24"/>
           <w:szCs w:val="24"/>
-          <w:lang w:val="en-DE" w:eastAsia="en-DE"/>
-        </w:rPr>
-        <w:t xml:space="preserve"> unavailable.</w:t>
+          <w:lang w:val="en-US"/>
+        </w:rPr>
+        <w:t xml:space="preserve"> If no data on forest growing stock on total forest area were reported at all, we searched</w:t>
       </w:r>
       <w:r>
         <w:rPr>
           <w:rFonts w:ascii="Times New Roman" w:eastAsia="Times New Roman" w:hAnsi="Times New Roman" w:cs="Times New Roman"/>
           <w:sz w:val="24"/>
           <w:szCs w:val="24"/>
-          <w:lang w:val="en-US" w:eastAsia="en-DE"/>
-        </w:rPr>
-        <w:t xml:space="preserve"> If no data on forest growing stock on total forest area were reported at all, we searched</w:t>
+          <w:lang w:val="en-US"/>
+        </w:rPr>
+        <w:t xml:space="preserve"> the FRA</w:t>
       </w:r>
       <w:r>
         <w:rPr>
           <w:rFonts w:ascii="Times New Roman" w:eastAsia="Times New Roman" w:hAnsi="Times New Roman" w:cs="Times New Roman"/>
           <w:sz w:val="24"/>
           <w:szCs w:val="24"/>
-          <w:lang w:val="en-US" w:eastAsia="en-DE"/>
-        </w:rPr>
-        <w:t xml:space="preserve"> the FRA</w:t>
+          <w:lang w:val="en-US"/>
+        </w:rPr>
+        <w:t xml:space="preserve"> 2020</w:t>
       </w:r>
       <w:r>
         <w:rPr>
           <w:rFonts w:ascii="Times New Roman" w:eastAsia="Times New Roman" w:hAnsi="Times New Roman" w:cs="Times New Roman"/>
           <w:sz w:val="24"/>
           <w:szCs w:val="24"/>
-          <w:lang w:val="en-US" w:eastAsia="en-DE"/>
-        </w:rPr>
-        <w:t xml:space="preserve"> 2020</w:t>
+          <w:lang w:val="en-US"/>
+        </w:rPr>
+        <w:t xml:space="preserve"> database</w:t>
       </w:r>
       <w:r>
         <w:rPr>
           <w:rFonts w:ascii="Times New Roman" w:eastAsia="Times New Roman" w:hAnsi="Times New Roman" w:cs="Times New Roman"/>
           <w:sz w:val="24"/>
           <w:szCs w:val="24"/>
-          <w:lang w:val="en-US" w:eastAsia="en-DE"/>
-        </w:rPr>
-        <w:t xml:space="preserve"> database</w:t>
+          <w:lang w:val="en-US"/>
+        </w:rPr>
+        <w:t xml:space="preserve"> for </w:t>
       </w:r>
       <w:r>
         <w:rPr>
           <w:rFonts w:ascii="Times New Roman" w:eastAsia="Times New Roman" w:hAnsi="Times New Roman" w:cs="Times New Roman"/>
           <w:sz w:val="24"/>
           <w:szCs w:val="24"/>
-          <w:lang w:val="en-US" w:eastAsia="en-DE"/>
-        </w:rPr>
-        <w:t xml:space="preserve"> for </w:t>
+          <w:lang/>
+        </w:rPr>
+        <w:t>data specific to naturally regenerated and/or planted forest areas</w:t>
       </w:r>
       <w:r>
         <w:rPr>
           <w:rFonts w:ascii="Times New Roman" w:eastAsia="Times New Roman" w:hAnsi="Times New Roman" w:cs="Times New Roman"/>
           <w:sz w:val="24"/>
           <w:szCs w:val="24"/>
-          <w:lang w:val="en-DE" w:eastAsia="en-DE"/>
-        </w:rPr>
-        <w:t>data specific to naturally regenerated and/or planted forest areas</w:t>
-      </w:r>
-      <w:r>
+          <w:lang w:val="en-US"/>
+        </w:rPr>
+        <w:t xml:space="preserve">. </w:t>
+      </w:r>
+    </w:p>
+    <w:p>
+      <w:pPr>
+        <w:spacing w:before="100" w:beforeAutospacing="1" w:after="100" w:afterAutospacing="1" w:line="240" w:lineRule="auto"/>
         <w:rPr>
           <w:rFonts w:ascii="Times New Roman" w:eastAsia="Times New Roman" w:hAnsi="Times New Roman" w:cs="Times New Roman"/>
           <w:sz w:val="24"/>
           <w:szCs w:val="24"/>
-          <w:lang w:val="en-US" w:eastAsia="en-DE"/>
-        </w:rPr>
-        <w:t xml:space="preserve">. </w:t>
-      </w:r>
-    </w:p>
-    <w:p>
-      <w:pPr>
-        <w:spacing w:before="100" w:beforeAutospacing="1" w:after="100" w:afterAutospacing="1" w:line="240" w:lineRule="auto"/>
+          <w:lang w:val="en-US"/>
+        </w:rPr>
+      </w:pPr>
+      <w:r>
         <w:rPr>
           <w:rFonts w:ascii="Times New Roman" w:eastAsia="Times New Roman" w:hAnsi="Times New Roman" w:cs="Times New Roman"/>
           <w:sz w:val="24"/>
           <w:szCs w:val="24"/>
-          <w:lang w:val="en-US" w:eastAsia="en-DE"/>
-        </w:rPr>
-      </w:pPr>
+          <w:lang/>
+        </w:rPr>
+        <w:t xml:space="preserve">In some instances, </w:t>
+      </w:r>
       <w:r>
         <w:rPr>
           <w:rFonts w:ascii="Times New Roman" w:eastAsia="Times New Roman" w:hAnsi="Times New Roman" w:cs="Times New Roman"/>
           <w:sz w:val="24"/>
           <w:szCs w:val="24"/>
-          <w:lang w:val="en-DE" w:eastAsia="en-DE"/>
-        </w:rPr>
-        <w:t xml:space="preserve">In some instances, </w:t>
+          <w:lang w:val="en-US"/>
+        </w:rPr>
+        <w:t xml:space="preserve">total </w:t>
       </w:r>
       <w:r>
         <w:rPr>
           <w:rFonts w:ascii="Times New Roman" w:eastAsia="Times New Roman" w:hAnsi="Times New Roman" w:cs="Times New Roman"/>
           <w:sz w:val="24"/>
           <w:szCs w:val="24"/>
-          <w:lang w:val="en-US" w:eastAsia="en-DE"/>
-        </w:rPr>
-        <w:t xml:space="preserve">total </w:t>
+          <w:lang/>
+        </w:rPr>
+        <w:t>forest growing stock was calculated from the FRA biomass stock (measured in t/ha). This approach provides an alternative estimation based on biomass density</w:t>
       </w:r>
       <w:r>
         <w:rPr>
           <w:rFonts w:ascii="Times New Roman" w:eastAsia="Times New Roman" w:hAnsi="Times New Roman" w:cs="Times New Roman"/>
           <w:sz w:val="24"/>
           <w:szCs w:val="24"/>
-          <w:lang w:val="en-DE" w:eastAsia="en-DE"/>
-        </w:rPr>
-        <w:t>forest growing stock was calculated from the FRA biomass stock (measured in t/ha). This approach provides an alternative estimation based on biomass density</w:t>
-      </w:r>
-      <w:r>
+          <w:lang w:val="en-US"/>
+        </w:rPr>
+        <w:t xml:space="preserve"> when forest growing stock reports for any forest type were non-available. </w:t>
+      </w:r>
+    </w:p>
+    <w:p>
+      <w:pPr>
+        <w:spacing w:before="100" w:beforeAutospacing="1" w:after="100" w:afterAutospacing="1" w:line="240" w:lineRule="auto"/>
         <w:rPr>
           <w:rFonts w:ascii="Times New Roman" w:eastAsia="Times New Roman" w:hAnsi="Times New Roman" w:cs="Times New Roman"/>
           <w:sz w:val="24"/>
           <w:szCs w:val="24"/>
-          <w:lang w:val="en-US" w:eastAsia="en-DE"/>
-        </w:rPr>
-        <w:t xml:space="preserve"> when forest growing stock reports for any forest type were non-available. </w:t>
-      </w:r>
-    </w:p>
-    <w:p>
-      <w:pPr>
-        <w:spacing w:before="100" w:beforeAutospacing="1" w:after="100" w:afterAutospacing="1" w:line="240" w:lineRule="auto"/>
+          <w:lang/>
+        </w:rPr>
+      </w:pPr>
+      <w:r>
         <w:rPr>
           <w:rFonts w:ascii="Times New Roman" w:eastAsia="Times New Roman" w:hAnsi="Times New Roman" w:cs="Times New Roman"/>
           <w:sz w:val="24"/>
           <w:szCs w:val="24"/>
-          <w:lang w:val="en-DE" w:eastAsia="en-DE"/>
-        </w:rPr>
-      </w:pPr>
+          <w:lang/>
+        </w:rPr>
+        <w:t xml:space="preserve">For </w:t>
+      </w:r>
       <w:r>
         <w:rPr>
           <w:rFonts w:ascii="Times New Roman" w:eastAsia="Times New Roman" w:hAnsi="Times New Roman" w:cs="Times New Roman"/>
           <w:sz w:val="24"/>
           <w:szCs w:val="24"/>
-          <w:lang w:val="en-DE" w:eastAsia="en-DE"/>
-        </w:rPr>
-        <w:t xml:space="preserve">For </w:t>
-      </w:r>
-      <w:r>
-        <w:rPr>
-          <w:rFonts w:ascii="Times New Roman" w:eastAsia="Times New Roman" w:hAnsi="Times New Roman" w:cs="Times New Roman"/>
-          <w:sz w:val="24"/>
-          <w:szCs w:val="24"/>
-          <w:lang w:val="en-US" w:eastAsia="en-DE"/>
+          <w:lang w:val="en-US"/>
         </w:rPr>
         <w:t xml:space="preserve">those countries not covered by the </w:t>
       </w:r>
@@ -4281,7 +4216,7 @@
           <w:bCs/>
           <w:sz w:val="24"/>
           <w:szCs w:val="24"/>
-          <w:lang w:val="en-US" w:eastAsia="en-DE"/>
+          <w:lang w:val="en-US"/>
         </w:rPr>
         <w:t>FRA</w:t>
       </w:r>
@@ -4292,7 +4227,7 @@
           <w:bCs/>
           <w:sz w:val="24"/>
           <w:szCs w:val="24"/>
-          <w:lang w:val="en-US" w:eastAsia="en-DE"/>
+          <w:lang w:val="en-US"/>
         </w:rPr>
         <w:t xml:space="preserve"> 2020</w:t>
       </w:r>
@@ -4301,7 +4236,7 @@
           <w:rFonts w:ascii="Times New Roman" w:eastAsia="Times New Roman" w:hAnsi="Times New Roman" w:cs="Times New Roman"/>
           <w:sz w:val="24"/>
           <w:szCs w:val="24"/>
-          <w:lang w:val="en-US" w:eastAsia="en-DE"/>
+          <w:lang w:val="en-US"/>
         </w:rPr>
         <w:t xml:space="preserve"> reports</w:t>
       </w:r>
@@ -4310,7 +4245,7 @@
           <w:rFonts w:ascii="Times New Roman" w:eastAsia="Times New Roman" w:hAnsi="Times New Roman" w:cs="Times New Roman"/>
           <w:sz w:val="24"/>
           <w:szCs w:val="24"/>
-          <w:lang w:val="en-DE" w:eastAsia="en-DE"/>
+          <w:lang/>
         </w:rPr>
         <w:t>, the</w:t>
       </w:r>
@@ -4319,7 +4254,7 @@
           <w:rFonts w:ascii="Times New Roman" w:eastAsia="Times New Roman" w:hAnsi="Times New Roman" w:cs="Times New Roman"/>
           <w:sz w:val="24"/>
           <w:szCs w:val="24"/>
-          <w:lang w:val="en-US" w:eastAsia="en-DE"/>
+          <w:lang w:val="en-US"/>
         </w:rPr>
         <w:t xml:space="preserve"> total</w:t>
       </w:r>
@@ -4328,11 +4263,10 @@
           <w:rFonts w:ascii="Times New Roman" w:eastAsia="Times New Roman" w:hAnsi="Times New Roman" w:cs="Times New Roman"/>
           <w:sz w:val="24"/>
           <w:szCs w:val="24"/>
-          <w:lang w:val="en-DE" w:eastAsia="en-DE"/>
+          <w:lang/>
         </w:rPr>
         <w:t xml:space="preserve"> forest growing stock was calculated using data from the </w:t>
       </w:r>
-      <w:proofErr w:type="spellStart"/>
       <w:r>
         <w:rPr>
           <w:rFonts w:ascii="Times New Roman" w:eastAsia="Times New Roman" w:hAnsi="Times New Roman" w:cs="Times New Roman"/>
@@ -4340,28 +4274,16 @@
           <w:bCs/>
           <w:sz w:val="24"/>
           <w:szCs w:val="24"/>
-          <w:lang w:val="en-DE" w:eastAsia="en-DE"/>
-        </w:rPr>
-        <w:t>GlobalForestWatch</w:t>
-      </w:r>
-      <w:proofErr w:type="spellEnd"/>
-      <w:r>
-        <w:rPr>
-          <w:rFonts w:ascii="Times New Roman" w:eastAsia="Times New Roman" w:hAnsi="Times New Roman" w:cs="Times New Roman"/>
-          <w:b/>
-          <w:bCs/>
-          <w:sz w:val="24"/>
-          <w:szCs w:val="24"/>
-          <w:lang w:val="en-DE" w:eastAsia="en-DE"/>
-        </w:rPr>
-        <w:t xml:space="preserve"> </w:t>
+          <w:lang/>
+        </w:rPr>
+        <w:t xml:space="preserve">GlobalForestWatch </w:t>
       </w:r>
       <w:r>
         <w:rPr>
           <w:rFonts w:ascii="Times New Roman" w:eastAsia="Times New Roman" w:hAnsi="Times New Roman" w:cs="Times New Roman"/>
           <w:sz w:val="24"/>
           <w:szCs w:val="24"/>
-          <w:lang w:val="en-US" w:eastAsia="en-DE"/>
+          <w:lang w:val="en-US"/>
         </w:rPr>
         <w:t>(</w:t>
       </w:r>
@@ -4370,7 +4292,7 @@
           <w:rFonts w:ascii="Times New Roman" w:eastAsia="Times New Roman" w:hAnsi="Times New Roman" w:cs="Times New Roman"/>
           <w:sz w:val="24"/>
           <w:szCs w:val="24"/>
-          <w:lang w:val="en-US" w:eastAsia="en-DE"/>
+          <w:lang w:val="en-US"/>
         </w:rPr>
         <w:t xml:space="preserve">GFW </w:t>
       </w:r>
@@ -4379,7 +4301,7 @@
           <w:rFonts w:ascii="Times New Roman" w:eastAsia="Times New Roman" w:hAnsi="Times New Roman" w:cs="Times New Roman"/>
           <w:sz w:val="24"/>
           <w:szCs w:val="24"/>
-          <w:lang w:val="en-US" w:eastAsia="en-DE"/>
+          <w:lang w:val="en-US"/>
         </w:rPr>
         <w:t>2024)</w:t>
       </w:r>
@@ -4388,7 +4310,7 @@
           <w:rFonts w:ascii="Times New Roman" w:eastAsia="Times New Roman" w:hAnsi="Times New Roman" w:cs="Times New Roman"/>
           <w:sz w:val="24"/>
           <w:szCs w:val="24"/>
-          <w:lang w:val="en-US" w:eastAsia="en-DE"/>
+          <w:lang w:val="en-US"/>
         </w:rPr>
         <w:t xml:space="preserve"> </w:t>
       </w:r>
@@ -4397,7 +4319,7 @@
           <w:rFonts w:ascii="Times New Roman" w:eastAsia="Times New Roman" w:hAnsi="Times New Roman" w:cs="Times New Roman"/>
           <w:sz w:val="24"/>
           <w:szCs w:val="24"/>
-          <w:lang w:val="en-DE" w:eastAsia="en-DE"/>
+          <w:lang/>
         </w:rPr>
         <w:t>on living woody biomass density.</w:t>
       </w:r>
@@ -4406,7 +4328,7 @@
           <w:rFonts w:ascii="Times New Roman" w:eastAsia="Times New Roman" w:hAnsi="Times New Roman" w:cs="Times New Roman"/>
           <w:sz w:val="24"/>
           <w:szCs w:val="24"/>
-          <w:lang w:val="en-US" w:eastAsia="en-DE"/>
+          <w:lang w:val="en-US"/>
         </w:rPr>
         <w:t xml:space="preserve"> </w:t>
       </w:r>
@@ -4415,7 +4337,7 @@
           <w:rFonts w:ascii="Times New Roman" w:eastAsia="Times New Roman" w:hAnsi="Times New Roman" w:cs="Times New Roman"/>
           <w:sz w:val="24"/>
           <w:szCs w:val="24"/>
-          <w:lang w:val="en-DE" w:eastAsia="en-DE"/>
+          <w:lang/>
         </w:rPr>
         <w:t xml:space="preserve">If the </w:t>
       </w:r>
@@ -4424,7 +4346,7 @@
           <w:rFonts w:ascii="Times New Roman" w:eastAsia="Times New Roman" w:hAnsi="Times New Roman" w:cs="Times New Roman"/>
           <w:sz w:val="24"/>
           <w:szCs w:val="24"/>
-          <w:lang w:val="en-US" w:eastAsia="en-DE"/>
+          <w:lang w:val="en-US"/>
         </w:rPr>
         <w:t xml:space="preserve">reported forest </w:t>
       </w:r>
@@ -4433,7 +4355,7 @@
           <w:rFonts w:ascii="Times New Roman" w:eastAsia="Times New Roman" w:hAnsi="Times New Roman" w:cs="Times New Roman"/>
           <w:sz w:val="24"/>
           <w:szCs w:val="24"/>
-          <w:lang w:val="en-DE" w:eastAsia="en-DE"/>
+          <w:lang/>
         </w:rPr>
         <w:t>area was greater than 1</w:t>
       </w:r>
@@ -4442,7 +4364,7 @@
           <w:rFonts w:ascii="Times New Roman" w:eastAsia="Times New Roman" w:hAnsi="Times New Roman" w:cs="Times New Roman"/>
           <w:sz w:val="24"/>
           <w:szCs w:val="24"/>
-          <w:lang w:val="en-US" w:eastAsia="en-DE"/>
+          <w:lang w:val="en-US"/>
         </w:rPr>
         <w:t xml:space="preserve"> while the growing forest stock was reported and/or calculated to be smaller than 1</w:t>
       </w:r>
@@ -4451,7 +4373,7 @@
           <w:rFonts w:ascii="Times New Roman" w:eastAsia="Times New Roman" w:hAnsi="Times New Roman" w:cs="Times New Roman"/>
           <w:sz w:val="24"/>
           <w:szCs w:val="24"/>
-          <w:lang w:val="en-DE" w:eastAsia="en-DE"/>
+          <w:lang/>
         </w:rPr>
         <w:t>, a correction was applied where the stock value was set to 1. This correction was necessary to standardize data across the dataset and ensure that unrealistic or inconsistent values were adjusted.</w:t>
       </w:r>
@@ -4460,7 +4382,7 @@
           <w:rFonts w:ascii="Times New Roman" w:eastAsia="Times New Roman" w:hAnsi="Times New Roman" w:cs="Times New Roman"/>
           <w:sz w:val="24"/>
           <w:szCs w:val="24"/>
-          <w:lang w:val="en-US" w:eastAsia="en-DE"/>
+          <w:lang w:val="en-US"/>
         </w:rPr>
         <w:t xml:space="preserve"> </w:t>
       </w:r>
@@ -4484,6 +4406,7 @@
         </w:rPr>
       </w:pPr>
       <w:r>
+        <w:lastRenderedPageBreak/>
         <w:t>The values for forest growing stock and annual forest stock growth are provided in the accompanying table.</w:t>
       </w:r>
     </w:p>
@@ -4608,14 +4531,7 @@
           <w:rFonts w:ascii="Times New Roman" w:hAnsi="Times New Roman" w:cs="Times New Roman"/>
           <w:lang w:val="en-US"/>
         </w:rPr>
-        <w:t xml:space="preserve"> </w:t>
-      </w:r>
-      <w:r>
-        <w:rPr>
-          <w:rFonts w:ascii="Times New Roman" w:hAnsi="Times New Roman" w:cs="Times New Roman"/>
-          <w:lang w:val="en-US"/>
-        </w:rPr>
-        <w:t>(million m</w:t>
+        <w:t xml:space="preserve"> (million m</w:t>
       </w:r>
       <w:r>
         <w:rPr>
@@ -4843,7 +4759,7 @@
           <w:rFonts w:ascii="Times New Roman" w:eastAsia="Times New Roman" w:hAnsi="Times New Roman" w:cs="Times New Roman"/>
           <w:sz w:val="24"/>
           <w:szCs w:val="24"/>
-          <w:lang w:val="en-DE" w:eastAsia="en-DE"/>
+          <w:lang/>
         </w:rPr>
         <w:t xml:space="preserve"> </w:t>
       </w:r>
@@ -4852,7 +4768,7 @@
           <w:rFonts w:ascii="Times New Roman" w:eastAsia="Times New Roman" w:hAnsi="Times New Roman" w:cs="Times New Roman"/>
           <w:sz w:val="24"/>
           <w:szCs w:val="24"/>
-          <w:lang w:val="en-DE" w:eastAsia="en-DE"/>
+          <w:lang/>
         </w:rPr>
         <w:t>This flag indicates that due to the lack of reliable data on stock growth, no estimation could be made.</w:t>
       </w:r>
@@ -4861,7 +4777,7 @@
       <w:pPr>
         <w:rPr>
           <w:rFonts w:ascii="Times New Roman" w:hAnsi="Times New Roman" w:cs="Times New Roman"/>
-          <w:lang w:val="en-DE"/>
+          <w:lang/>
         </w:rPr>
       </w:pPr>
     </w:p>
@@ -4887,13 +4803,7 @@
         <w:rPr>
           <w:lang w:val="en-US"/>
         </w:rPr>
-        <w:t>B</w:t>
-      </w:r>
-      <w:r>
-        <w:rPr>
-          <w:lang w:val="en-US"/>
-        </w:rPr>
-        <w:t xml:space="preserve">uongiorno, Joseph; Zhu, </w:t>
+        <w:t xml:space="preserve">Buongiorno, Joseph; Zhu, </w:t>
       </w:r>
       <w:proofErr w:type="spellStart"/>
       <w:r>
@@ -5109,13 +5019,7 @@
         <w:rPr>
           <w:lang w:val="en-US"/>
         </w:rPr>
-        <w:t xml:space="preserve"> </w:t>
-      </w:r>
-      <w:r>
-        <w:rPr>
-          <w:lang w:val="en-US"/>
-        </w:rPr>
-        <w:t>https://github.com/TI-Forest-Sector-Modelling/TiMBA</w:t>
+        <w:t xml:space="preserve"> https://github.com/TI-Forest-Sector-Modelling/TiMBA</w:t>
       </w:r>
       <w:proofErr w:type="gramEnd"/>
     </w:p>
@@ -5130,13 +5034,7 @@
         <w:rPr>
           <w:lang w:val="en-US"/>
         </w:rPr>
-        <w:t>W</w:t>
-      </w:r>
-      <w:r>
-        <w:rPr>
-          <w:lang w:val="en-US"/>
-        </w:rPr>
-        <w:t>TO (2024): World Trade Organization - Integrated Database. Available online at https://www.wto.org/english/tratop_e/tariffs_e/idb_e.htm.</w:t>
+        <w:t>WTO (2024): World Trade Organization - Integrated Database. Available online at https://www.wto.org/english/tratop_e/tariffs_e/idb_e.htm.</w:t>
       </w:r>
     </w:p>
     <w:bookmarkEnd w:id="14"/>
@@ -5156,6 +5054,31 @@
     </w:sectPr>
   </w:body>
 </w:document>
+</file>
+
+<file path=word/endnotes.xml><?xml version="1.0" encoding="utf-8"?>
+<w:endnotes xmlns:wpc="http://schemas.microsoft.com/office/word/2010/wordprocessingCanvas" xmlns:cx="http://schemas.microsoft.com/office/drawing/2014/chartex" xmlns:cx1="http://schemas.microsoft.com/office/drawing/2015/9/8/chartex" xmlns:cx2="http://schemas.microsoft.com/office/drawing/2015/10/21/chartex" xmlns:cx3="http://schemas.microsoft.com/office/drawing/2016/5/9/chartex" xmlns:cx4="http://schemas.microsoft.com/office/drawing/2016/5/10/chartex" xmlns:cx5="http://schemas.microsoft.com/office/drawing/2016/5/11/chartex" xmlns:cx6="http://schemas.microsoft.com/office/drawing/2016/5/12/chartex" xmlns:cx7="http://schemas.microsoft.com/office/drawing/2016/5/13/chartex" xmlns:cx8="http://schemas.microsoft.com/office/drawing/2016/5/14/chartex" xmlns:mc="http://schemas.openxmlformats.org/markup-compatibility/2006" xmlns:aink="http://schemas.microsoft.com/office/drawing/2016/ink" xmlns:am3d="http://schemas.microsoft.com/office/drawing/2017/model3d" xmlns:o="urn:schemas-microsoft-com:office:office" xmlns:r="http://schemas.openxmlformats.org/officeDocument/2006/relationships" xmlns:m="http://schemas.openxmlformats.org/officeDocument/2006/math" xmlns:v="urn:schemas-microsoft-com:vml" xmlns:wp14="http://schemas.microsoft.com/office/word/2010/wordprocessingDrawing" xmlns:wp="http://schemas.openxmlformats.org/drawingml/2006/wordprocessingDrawing" xmlns:w10="urn:schemas-microsoft-com:office:word" xmlns:w="http://schemas.openxmlformats.org/wordprocessingml/2006/main" xmlns:w14="http://schemas.microsoft.com/office/word/2010/wordml" xmlns:w15="http://schemas.microsoft.com/office/word/2012/wordml" xmlns:w16cex="http://schemas.microsoft.com/office/word/2018/wordml/cex" xmlns:w16cid="http://schemas.microsoft.com/office/word/2016/wordml/cid" xmlns:w16="http://schemas.microsoft.com/office/word/2018/wordml" xmlns:w16sdtdh="http://schemas.microsoft.com/office/word/2020/wordml/sdtdatahash" xmlns:w16se="http://schemas.microsoft.com/office/word/2015/wordml/symex" xmlns:wpg="http://schemas.microsoft.com/office/word/2010/wordprocessingGroup" xmlns:wpi="http://schemas.microsoft.com/office/word/2010/wordprocessingInk" xmlns:wne="http://schemas.microsoft.com/office/word/2006/wordml" xmlns:wps="http://schemas.microsoft.com/office/word/2010/wordprocessingShape" mc:Ignorable="w14 w15 w16se w16cid w16 w16cex w16sdtdh wp14">
+  <w:endnote w:type="separator" w:id="-1">
+    <w:p>
+      <w:pPr>
+        <w:spacing w:after="0" w:line="240" w:lineRule="auto"/>
+      </w:pPr>
+      <w:r>
+        <w:separator/>
+      </w:r>
+    </w:p>
+  </w:endnote>
+  <w:endnote w:type="continuationSeparator" w:id="0">
+    <w:p>
+      <w:pPr>
+        <w:spacing w:after="0" w:line="240" w:lineRule="auto"/>
+      </w:pPr>
+      <w:r>
+        <w:continuationSeparator/>
+      </w:r>
+    </w:p>
+  </w:endnote>
+</w:endnotes>
 </file>
 
 <file path=word/footer1.xml><?xml version="1.0" encoding="utf-8"?>
@@ -5209,6 +5132,31 @@
     </w:pPr>
   </w:p>
 </w:ftr>
+</file>
+
+<file path=word/footnotes.xml><?xml version="1.0" encoding="utf-8"?>
+<w:footnotes xmlns:wpc="http://schemas.microsoft.com/office/word/2010/wordprocessingCanvas" xmlns:cx="http://schemas.microsoft.com/office/drawing/2014/chartex" xmlns:cx1="http://schemas.microsoft.com/office/drawing/2015/9/8/chartex" xmlns:cx2="http://schemas.microsoft.com/office/drawing/2015/10/21/chartex" xmlns:cx3="http://schemas.microsoft.com/office/drawing/2016/5/9/chartex" xmlns:cx4="http://schemas.microsoft.com/office/drawing/2016/5/10/chartex" xmlns:cx5="http://schemas.microsoft.com/office/drawing/2016/5/11/chartex" xmlns:cx6="http://schemas.microsoft.com/office/drawing/2016/5/12/chartex" xmlns:cx7="http://schemas.microsoft.com/office/drawing/2016/5/13/chartex" xmlns:cx8="http://schemas.microsoft.com/office/drawing/2016/5/14/chartex" xmlns:mc="http://schemas.openxmlformats.org/markup-compatibility/2006" xmlns:aink="http://schemas.microsoft.com/office/drawing/2016/ink" xmlns:am3d="http://schemas.microsoft.com/office/drawing/2017/model3d" xmlns:o="urn:schemas-microsoft-com:office:office" xmlns:r="http://schemas.openxmlformats.org/officeDocument/2006/relationships" xmlns:m="http://schemas.openxmlformats.org/officeDocument/2006/math" xmlns:v="urn:schemas-microsoft-com:vml" xmlns:wp14="http://schemas.microsoft.com/office/word/2010/wordprocessingDrawing" xmlns:wp="http://schemas.openxmlformats.org/drawingml/2006/wordprocessingDrawing" xmlns:w10="urn:schemas-microsoft-com:office:word" xmlns:w="http://schemas.openxmlformats.org/wordprocessingml/2006/main" xmlns:w14="http://schemas.microsoft.com/office/word/2010/wordml" xmlns:w15="http://schemas.microsoft.com/office/word/2012/wordml" xmlns:w16cex="http://schemas.microsoft.com/office/word/2018/wordml/cex" xmlns:w16cid="http://schemas.microsoft.com/office/word/2016/wordml/cid" xmlns:w16="http://schemas.microsoft.com/office/word/2018/wordml" xmlns:w16sdtdh="http://schemas.microsoft.com/office/word/2020/wordml/sdtdatahash" xmlns:w16se="http://schemas.microsoft.com/office/word/2015/wordml/symex" xmlns:wpg="http://schemas.microsoft.com/office/word/2010/wordprocessingGroup" xmlns:wpi="http://schemas.microsoft.com/office/word/2010/wordprocessingInk" xmlns:wne="http://schemas.microsoft.com/office/word/2006/wordml" xmlns:wps="http://schemas.microsoft.com/office/word/2010/wordprocessingShape" mc:Ignorable="w14 w15 w16se w16cid w16 w16cex w16sdtdh wp14">
+  <w:footnote w:type="separator" w:id="-1">
+    <w:p>
+      <w:pPr>
+        <w:spacing w:after="0" w:line="240" w:lineRule="auto"/>
+      </w:pPr>
+      <w:r>
+        <w:separator/>
+      </w:r>
+    </w:p>
+  </w:footnote>
+  <w:footnote w:type="continuationSeparator" w:id="0">
+    <w:p>
+      <w:pPr>
+        <w:spacing w:after="0" w:line="240" w:lineRule="auto"/>
+      </w:pPr>
+      <w:r>
+        <w:continuationSeparator/>
+      </w:r>
+    </w:p>
+  </w:footnote>
+</w:footnotes>
 </file>
 
 <file path=word/numbering.xml><?xml version="1.0" encoding="utf-8"?>
@@ -6001,6 +5949,7 @@
     <w:lsdException w:name="HTML Sample" w:semiHidden="1" w:unhideWhenUsed="1"/>
     <w:lsdException w:name="HTML Typewriter" w:semiHidden="1" w:unhideWhenUsed="1"/>
     <w:lsdException w:name="HTML Variable" w:semiHidden="1" w:unhideWhenUsed="1"/>
+    <w:lsdException w:name="Normal Table" w:semiHidden="1" w:unhideWhenUsed="1"/>
     <w:lsdException w:name="annotation subject" w:semiHidden="1" w:unhideWhenUsed="1"/>
     <w:lsdException w:name="No List" w:semiHidden="1" w:unhideWhenUsed="1"/>
     <w:lsdException w:name="Outline List 1" w:semiHidden="1" w:unhideWhenUsed="1"/>
@@ -6047,8 +5996,10 @@
     <w:lsdException w:name="Table Subtle 2" w:semiHidden="1" w:unhideWhenUsed="1"/>
     <w:lsdException w:name="Table Web 1" w:semiHidden="1" w:unhideWhenUsed="1"/>
     <w:lsdException w:name="Table Web 2" w:semiHidden="1" w:unhideWhenUsed="1"/>
+    <w:lsdException w:name="Table Web 3" w:semiHidden="1" w:unhideWhenUsed="1"/>
     <w:lsdException w:name="Balloon Text" w:semiHidden="1" w:unhideWhenUsed="1"/>
     <w:lsdException w:name="Table Grid" w:uiPriority="39"/>
+    <w:lsdException w:name="Table Theme" w:semiHidden="1" w:unhideWhenUsed="1"/>
     <w:lsdException w:name="Placeholder Text" w:semiHidden="1"/>
     <w:lsdException w:name="No Spacing" w:uiPriority="1" w:qFormat="1"/>
     <w:lsdException w:name="Light Shading" w:uiPriority="60"/>
@@ -6293,7 +6244,7 @@
       <w:kern w:val="36"/>
       <w:sz w:val="48"/>
       <w:szCs w:val="48"/>
-      <w:lang w:val="en-DE" w:eastAsia="en-DE"/>
+      <w:lang/>
     </w:rPr>
   </w:style>
   <w:style w:type="paragraph" w:styleId="Heading2">
@@ -6403,7 +6354,7 @@
       <w:kern w:val="36"/>
       <w:sz w:val="48"/>
       <w:szCs w:val="48"/>
-      <w:lang w:val="en-DE" w:eastAsia="en-DE"/>
+      <w:lang/>
     </w:rPr>
   </w:style>
   <w:style w:type="character" w:customStyle="1" w:styleId="Heading2Char">
@@ -6445,7 +6396,7 @@
       <w:rFonts w:ascii="Times New Roman" w:eastAsia="Times New Roman" w:hAnsi="Times New Roman" w:cs="Times New Roman"/>
       <w:sz w:val="24"/>
       <w:szCs w:val="24"/>
-      <w:lang w:val="en-DE" w:eastAsia="en-DE"/>
+      <w:lang/>
     </w:rPr>
   </w:style>
   <w:style w:type="character" w:styleId="Strong">

</xml_diff>